<commit_message>
Update: name Pachovski + email + EUR prices in DOCX; Google Maps embed in page
</commit_message>
<xml_diff>
--- a/Exam-Claude-Webpage.docx
+++ b/Exam-Claude-Webpage.docx
@@ -143,7 +143,7 @@
                 <w:sz w:val="22"/>
                 <w:szCs w:val="22"/>
               </w:rPr>
-              <w:t xml:space="preserve">Божидар</w:t>
+              <w:t xml:space="preserve">Божидар Пачовски</w:t>
             </w:r>
           </w:p>
         </w:tc>
@@ -291,7 +291,7 @@
                 <w:sz w:val="22"/>
                 <w:szCs w:val="22"/>
               </w:rPr>
-              <w:t xml:space="preserve">bozhidar@pulse.bg</w:t>
+              <w:t xml:space="preserve">pachovski@gmail.com</w:t>
             </w:r>
           </w:p>
         </w:tc>
@@ -561,7 +561,7 @@
                 <w:sz w:val="22"/>
                 <w:szCs w:val="22"/>
               </w:rPr>
-              <w:t xml:space="preserve">Фитнес клуб FitZone (кв. Люлин, София) — 7 години работа, нулево онлайн присъствие. Клиентите се намират само по препоръка. Нужна е проста уебстраница с услуги, цени и форма за запис.</w:t>
+              <w:t xml:space="preserve">Фитнес клуб FitZone (кв. Люлин, София) — 7 години работа, нулево онлайн присъствие. Клиентите се намират само по препоръка. Нужна е проста уебстраница с услуги, цени в EUR и форма за запис.</w:t>
             </w:r>
           </w:p>
         </w:tc>
@@ -724,7 +724,7 @@
                 <w:sz w:val="22"/>
                 <w:szCs w:val="22"/>
               </w:rPr>
-              <w:t xml:space="preserve">Работя по проблем в сферата на малкия бизнес / услуги. Проблемът е: Имам малък фитнес клуб в кв. Люлин, София (бул. Царица Йоанна 47), работещ вече 7 години, но без никакво онлайн присъствие — нямам уебсайт, намират ме само хора от квартала по препоръка. Искам потенциалните клиенти да могат да намерят информация за услугите ми (фитнес зала, кардио, групови тренировки, личен треньор), цените (от 10 лв./посещение до 599 лв./год.), работното време и да се запишат за безплатна пробна тренировка. Предложи ми просто решение, обясни на кого помага и дай идеята в 5-6 изречения.</w:t>
+              <w:t xml:space="preserve">Работя по проблем в сферата на малкия бизнес / услуги. Проблемът е: Имам малък фитнес клуб в кв. Люлин, София (бул. Царица Йоанна 47), работещ вече 7 години, но без никакво онлайн присъствие — нямам уебсайт, намират ме само хора от квартала по препоръка. Искам потенциалните клиенти да могат да намерят информация за услугите ми (фитнес зала, кардио, групови тренировки, личен треньор), цените (от 5 EUR/посещение до 306 EUR/год.), работното време и да се запишат за безплатна пробна тренировка. Предложи ми просто решение, обясни на кого помага и дай идеята в 5-6 изречения.</w:t>
             </w:r>
           </w:p>
         </w:tc>
@@ -798,7 +798,7 @@
                 <w:sz w:val="22"/>
                 <w:szCs w:val="22"/>
               </w:rPr>
-              <w:t xml:space="preserve">Предложеното решение е създаването на проста едностранична уебстраница (landing page) за FitZone, която съдържа меню с услуги, ценоразпис, седмична програма на груповите тренировки, форма за запис за безплатна пробна тренировка и информация за локация с работно време. Страницата помага на хора от квартала и около него, които търсят фитнес клуб в Google — те ще могат да намерят клуба, да разберат какво се предлага и на каква цена, и да се запишат за пробна тренировка без да се налага да се обаждат. Страницата е статична (само HTML/CSS/JS), може да се хоства безплатно в GitHub Pages, лесна е за поддържане и може да се надгради с онлайн резервации при нужда. Сигнатурният елемент е диагонална grid-текстура с лайм-зелен акцент (#d4f000), която дава енергичен, спортен характер без да изглежда шаблонно. Решението е приложимо веднага, без техническа поддръжка и без месечен разход.</w:t>
+              <w:t xml:space="preserve">Предложеното решение е създаването на проста едностранична уебстраница (landing page) за FitZone, която съдържа меню с услуги, ценоразпис в EUR, седмична програма на груповите тренировки, форма за запис за безплатна пробна тренировка, интерактивна Google Maps карта и информация за локация с работно време. Страницата помага на хора от квартала и около него, които търсят фитнес клуб в Google — те ще могат да намерят клуба, да разберат какво се предлага и на каква цена в евро, и да се запишат за пробна тренировка без да се налага да се обаждат. Страницата е статична (само HTML/CSS/JS), хоствана безплатно в GitHub Pages, лесна за поддържане и може да се надгради с онлайн резервации при нужда. Редизайнът следва UI/UX Pro Max Skill — Vibrant &amp; Block-based стил с оранжево-зелена цветова схема (#F97316 / #22C55E) на тъмен фон, подходящ за спортни брандове. Решението е приложимо веднага, без техническа поддръжка и без месечен разход.</w:t>
             </w:r>
           </w:p>
         </w:tc>
@@ -1019,7 +1019,7 @@
                 <w:sz w:val="22"/>
                 <w:szCs w:val="22"/>
               </w:rPr>
-              <w:t xml:space="preserve">Едностранична HTML уебстраница за FitZone - фитнес клуб в кв. Люлин. Секции: Hero с ключово послание, Услуги (4 карти), Цени (4 плана вкл. Най-популярен), Групови тренировки (таблица с 6 занятия), Форма за безплатна пробна тренировка, Локация с работно време.</w:t>
+              <w:t xml:space="preserve">Едностранична HTML уебстраница за FitZone - фитнес клуб в кв. Люлин. Секции: Hero, Услуги (4 карти), Цени в EUR (4 плана), Групови тренировки (6 занятия), Форма за запис, Google Maps карта, Локация. Редизайн по UI/UX Pro Max Skill.</w:t>
             </w:r>
           </w:p>
         </w:tc>
@@ -1093,7 +1093,7 @@
                 <w:sz w:val="22"/>
                 <w:szCs w:val="22"/>
               </w:rPr>
-              <w:t xml:space="preserve">Чист HTML5 / CSS3 / минимален JavaScript — без фреймуъркове. Хостван безплатно в GitHub Pages.</w:t>
+              <w:t xml:space="preserve">HTML5 / CSS3 / JavaScript — без фреймуъркове. Хостван безплатно в GitHub Pages. Google Maps Embed API за карта.</w:t>
             </w:r>
           </w:p>
         </w:tc>

</xml_diff>

<commit_message>
Fix: year 2025 → 2026 in banner and DOCX
</commit_message>
<xml_diff>
--- a/Exam-Claude-Webpage.docx
+++ b/Exam-Claude-Webpage.docx
@@ -1307,7 +1307,7 @@
           <w:sz w:val="22"/>
           <w:szCs w:val="22"/>
         </w:rPr>
-        <w:t xml:space="preserve">до 14 юни 2025 г., 21:59 ч.</w:t>
+        <w:t xml:space="preserve">до 14 юни 2026 г., 21:59 ч.</w:t>
       </w:r>
     </w:p>
     <w:p>
@@ -1330,7 +1330,7 @@
           <w:sz w:val="22"/>
           <w:szCs w:val="22"/>
         </w:rPr>
-        <w:t xml:space="preserve">до 21 юни 2025 г., 21:59 ч.</w:t>
+        <w:t xml:space="preserve">до 21 юни 2026 г., 21:59 ч.</w:t>
       </w:r>
     </w:p>
     <w:p>

</xml_diff>

<commit_message>
Add Rate modal with grade selection, flying letters, progress bar, success screen + new DOCX template filled in
</commit_message>
<xml_diff>
--- a/Exam-Claude-Webpage.docx
+++ b/Exam-Claude-Webpage.docx
@@ -4,7 +4,7 @@
   <w:body>
     <w:p>
       <w:pPr>
-        <w:spacing w:after="240" w:before="0"/>
+        <w:spacing w:after="160" w:before="0"/>
         <w:jc w:val="center"/>
       </w:pPr>
       <w:r>
@@ -20,7 +20,7 @@
     </w:p>
     <w:p>
       <w:pPr>
-        <w:spacing w:after="360" w:before="0"/>
+        <w:spacing w:after="80" w:before="0"/>
         <w:jc w:val="center"/>
       </w:pPr>
       <w:r>
@@ -36,18 +36,33 @@
     </w:p>
     <w:p>
       <w:pPr>
-        <w:spacing w:after="160" w:before="60"/>
+        <w:spacing w:after="360" w:before="0"/>
+        <w:jc w:val="center"/>
+      </w:pPr>
+      <w:r>
+        <w:rPr>
+          <w:rFonts w:ascii="Arial" w:cs="Arial" w:eastAsia="Arial" w:hAnsi="Arial"/>
+          <w:color w:val="888888"/>
+          <w:sz w:val="22"/>
+          <w:szCs w:val="22"/>
+        </w:rPr>
+        <w:t xml:space="preserve">Редовен изпит — юни 2026</w:t>
+      </w:r>
+    </w:p>
+    <w:p>
+      <w:pPr>
+        <w:spacing w:after="120" w:before="60"/>
       </w:pPr>
       <w:r>
         <w:rPr>
           <w:rFonts w:ascii="Arial" w:cs="Arial" w:eastAsia="Arial" w:hAnsi="Arial"/>
           <w:i w:val="false"/>
           <w:iCs w:val="false"/>
-          <w:color w:val="000000"/>
-          <w:sz w:val="22"/>
-          <w:szCs w:val="22"/>
-        </w:rPr>
-        <w:t xml:space="preserve">Настоящото задание за изпит има за цел да провери дали можете самостоятелно да използвате Claude за формулиране на реален проблем, генериране на приложимо решение и създаване на проста уебстраница, която представя решението по ясен и убедителен начин.</w:t>
+          <w:color w:val="333333"/>
+          <w:sz w:val="22"/>
+          <w:szCs w:val="22"/>
+        </w:rPr>
+        <w:t xml:space="preserve">Настоящото задание има за цел да провери дали можете самостоятелно да използвате Claude за формулиране на реален проблем, генериране на приложимо решение и създаване на проста уебстраница, която представя решението по ясен и убедителен начин.</w:t>
       </w:r>
     </w:p>
     <w:p>
@@ -79,23 +94,20 @@
           <w:tcPr>
             <w:tcW w:type="dxa" w:w="2268"/>
             <w:tcBorders>
-              <w:top w:val="single" w:color="AAAAAA" w:sz="4"/>
-              <w:left w:val="single" w:color="AAAAAA" w:sz="4"/>
-              <w:bottom w:val="single" w:color="AAAAAA" w:sz="4"/>
-              <w:right w:val="single" w:color="AAAAAA" w:sz="4"/>
-            </w:tcBorders>
-            <w:shd w:fill="F2F2F2" w:val="clear"/>
-            <w:tcMar>
-              <w:top w:type="dxa" w:w="100"/>
-              <w:left w:type="dxa" w:w="160"/>
-              <w:bottom w:type="dxa" w:w="100"/>
-              <w:right w:type="dxa" w:w="160"/>
-            </w:tcMar>
-          </w:tcPr>
-          <w:p>
-            <w:pPr>
-              <w:jc w:val="left"/>
-            </w:pPr>
+              <w:top w:val="single" w:color="CCCCCC" w:sz="4"/>
+              <w:left w:val="single" w:color="CCCCCC" w:sz="4"/>
+              <w:bottom w:val="single" w:color="CCCCCC" w:sz="4"/>
+              <w:right w:val="single" w:color="CCCCCC" w:sz="4"/>
+            </w:tcBorders>
+            <w:shd w:fill="F5F5F5" w:val="clear"/>
+            <w:tcMar>
+              <w:top w:type="dxa" w:w="120"/>
+              <w:left w:type="dxa" w:w="160"/>
+              <w:bottom w:type="dxa" w:w="120"/>
+              <w:right w:type="dxa" w:w="160"/>
+            </w:tcMar>
+          </w:tcPr>
+          <w:p>
             <w:r>
               <w:rPr>
                 <w:rFonts w:ascii="Arial" w:cs="Arial" w:eastAsia="Arial" w:hAnsi="Arial"/>
@@ -103,7 +115,7 @@
                 <w:bCs/>
                 <w:i w:val="false"/>
                 <w:iCs w:val="false"/>
-                <w:color w:val="000000"/>
+                <w:color w:val="333333"/>
                 <w:sz w:val="22"/>
                 <w:szCs w:val="22"/>
               </w:rPr>
@@ -113,25 +125,22 @@
         </w:tc>
         <w:tc>
           <w:tcPr>
-            <w:tcW w:type="dxa" w:w="7088"/>
-            <w:tcBorders>
-              <w:top w:val="single" w:color="AAAAAA" w:sz="4"/>
-              <w:left w:val="single" w:color="AAAAAA" w:sz="4"/>
-              <w:bottom w:val="single" w:color="AAAAAA" w:sz="4"/>
-              <w:right w:val="single" w:color="AAAAAA" w:sz="4"/>
+            <w:tcW w:type="dxa" w:w="7092"/>
+            <w:tcBorders>
+              <w:top w:val="single" w:color="CCCCCC" w:sz="4"/>
+              <w:left w:val="single" w:color="CCCCCC" w:sz="4"/>
+              <w:bottom w:val="single" w:color="CCCCCC" w:sz="4"/>
+              <w:right w:val="single" w:color="CCCCCC" w:sz="4"/>
             </w:tcBorders>
             <w:shd w:fill="FFFFFF" w:val="clear"/>
             <w:tcMar>
-              <w:top w:type="dxa" w:w="100"/>
-              <w:left w:type="dxa" w:w="160"/>
-              <w:bottom w:type="dxa" w:w="100"/>
-              <w:right w:type="dxa" w:w="160"/>
-            </w:tcMar>
-          </w:tcPr>
-          <w:p>
-            <w:pPr>
-              <w:jc w:val="left"/>
-            </w:pPr>
+              <w:top w:type="dxa" w:w="120"/>
+              <w:left w:type="dxa" w:w="160"/>
+              <w:bottom w:type="dxa" w:w="120"/>
+              <w:right w:type="dxa" w:w="160"/>
+            </w:tcMar>
+          </w:tcPr>
+          <w:p>
             <w:r>
               <w:rPr>
                 <w:rFonts w:ascii="Arial" w:cs="Arial" w:eastAsia="Arial" w:hAnsi="Arial"/>
@@ -139,7 +148,7 @@
                 <w:bCs w:val="false"/>
                 <w:i w:val="false"/>
                 <w:iCs w:val="false"/>
-                <w:color w:val="000000"/>
+                <w:color w:val="1C1C1C"/>
                 <w:sz w:val="22"/>
                 <w:szCs w:val="22"/>
               </w:rPr>
@@ -153,23 +162,20 @@
           <w:tcPr>
             <w:tcW w:type="dxa" w:w="2268"/>
             <w:tcBorders>
-              <w:top w:val="single" w:color="AAAAAA" w:sz="4"/>
-              <w:left w:val="single" w:color="AAAAAA" w:sz="4"/>
-              <w:bottom w:val="single" w:color="AAAAAA" w:sz="4"/>
-              <w:right w:val="single" w:color="AAAAAA" w:sz="4"/>
-            </w:tcBorders>
-            <w:shd w:fill="F2F2F2" w:val="clear"/>
-            <w:tcMar>
-              <w:top w:type="dxa" w:w="100"/>
-              <w:left w:type="dxa" w:w="160"/>
-              <w:bottom w:type="dxa" w:w="100"/>
-              <w:right w:type="dxa" w:w="160"/>
-            </w:tcMar>
-          </w:tcPr>
-          <w:p>
-            <w:pPr>
-              <w:jc w:val="left"/>
-            </w:pPr>
+              <w:top w:val="single" w:color="CCCCCC" w:sz="4"/>
+              <w:left w:val="single" w:color="CCCCCC" w:sz="4"/>
+              <w:bottom w:val="single" w:color="CCCCCC" w:sz="4"/>
+              <w:right w:val="single" w:color="CCCCCC" w:sz="4"/>
+            </w:tcBorders>
+            <w:shd w:fill="F5F5F5" w:val="clear"/>
+            <w:tcMar>
+              <w:top w:type="dxa" w:w="120"/>
+              <w:left w:type="dxa" w:w="160"/>
+              <w:bottom w:type="dxa" w:w="120"/>
+              <w:right w:type="dxa" w:w="160"/>
+            </w:tcMar>
+          </w:tcPr>
+          <w:p>
             <w:r>
               <w:rPr>
                 <w:rFonts w:ascii="Arial" w:cs="Arial" w:eastAsia="Arial" w:hAnsi="Arial"/>
@@ -177,7 +183,7 @@
                 <w:bCs/>
                 <w:i w:val="false"/>
                 <w:iCs w:val="false"/>
-                <w:color w:val="000000"/>
+                <w:color w:val="333333"/>
                 <w:sz w:val="22"/>
                 <w:szCs w:val="22"/>
               </w:rPr>
@@ -187,25 +193,22 @@
         </w:tc>
         <w:tc>
           <w:tcPr>
-            <w:tcW w:type="dxa" w:w="7088"/>
-            <w:tcBorders>
-              <w:top w:val="single" w:color="AAAAAA" w:sz="4"/>
-              <w:left w:val="single" w:color="AAAAAA" w:sz="4"/>
-              <w:bottom w:val="single" w:color="AAAAAA" w:sz="4"/>
-              <w:right w:val="single" w:color="AAAAAA" w:sz="4"/>
+            <w:tcW w:type="dxa" w:w="7092"/>
+            <w:tcBorders>
+              <w:top w:val="single" w:color="CCCCCC" w:sz="4"/>
+              <w:left w:val="single" w:color="CCCCCC" w:sz="4"/>
+              <w:bottom w:val="single" w:color="CCCCCC" w:sz="4"/>
+              <w:right w:val="single" w:color="CCCCCC" w:sz="4"/>
             </w:tcBorders>
             <w:shd w:fill="FFFFFF" w:val="clear"/>
             <w:tcMar>
-              <w:top w:type="dxa" w:w="100"/>
-              <w:left w:type="dxa" w:w="160"/>
-              <w:bottom w:type="dxa" w:w="100"/>
-              <w:right w:type="dxa" w:w="160"/>
-            </w:tcMar>
-          </w:tcPr>
-          <w:p>
-            <w:pPr>
-              <w:jc w:val="left"/>
-            </w:pPr>
+              <w:top w:type="dxa" w:w="120"/>
+              <w:left w:type="dxa" w:w="160"/>
+              <w:bottom w:type="dxa" w:w="120"/>
+              <w:right w:type="dxa" w:w="160"/>
+            </w:tcMar>
+          </w:tcPr>
+          <w:p>
             <w:r>
               <w:rPr>
                 <w:rFonts w:ascii="Arial" w:cs="Arial" w:eastAsia="Arial" w:hAnsi="Arial"/>
@@ -213,7 +216,7 @@
                 <w:bCs w:val="false"/>
                 <w:i w:val="false"/>
                 <w:iCs w:val="false"/>
-                <w:color w:val="000000"/>
+                <w:color w:val="1C1C1C"/>
                 <w:sz w:val="22"/>
                 <w:szCs w:val="22"/>
               </w:rPr>
@@ -227,23 +230,20 @@
           <w:tcPr>
             <w:tcW w:type="dxa" w:w="2268"/>
             <w:tcBorders>
-              <w:top w:val="single" w:color="AAAAAA" w:sz="4"/>
-              <w:left w:val="single" w:color="AAAAAA" w:sz="4"/>
-              <w:bottom w:val="single" w:color="AAAAAA" w:sz="4"/>
-              <w:right w:val="single" w:color="AAAAAA" w:sz="4"/>
-            </w:tcBorders>
-            <w:shd w:fill="F2F2F2" w:val="clear"/>
-            <w:tcMar>
-              <w:top w:type="dxa" w:w="100"/>
-              <w:left w:type="dxa" w:w="160"/>
-              <w:bottom w:type="dxa" w:w="100"/>
-              <w:right w:type="dxa" w:w="160"/>
-            </w:tcMar>
-          </w:tcPr>
-          <w:p>
-            <w:pPr>
-              <w:jc w:val="left"/>
-            </w:pPr>
+              <w:top w:val="single" w:color="CCCCCC" w:sz="4"/>
+              <w:left w:val="single" w:color="CCCCCC" w:sz="4"/>
+              <w:bottom w:val="single" w:color="CCCCCC" w:sz="4"/>
+              <w:right w:val="single" w:color="CCCCCC" w:sz="4"/>
+            </w:tcBorders>
+            <w:shd w:fill="F5F5F5" w:val="clear"/>
+            <w:tcMar>
+              <w:top w:type="dxa" w:w="120"/>
+              <w:left w:type="dxa" w:w="160"/>
+              <w:bottom w:type="dxa" w:w="120"/>
+              <w:right w:type="dxa" w:w="160"/>
+            </w:tcMar>
+          </w:tcPr>
+          <w:p>
             <w:r>
               <w:rPr>
                 <w:rFonts w:ascii="Arial" w:cs="Arial" w:eastAsia="Arial" w:hAnsi="Arial"/>
@@ -251,7 +251,7 @@
                 <w:bCs/>
                 <w:i w:val="false"/>
                 <w:iCs w:val="false"/>
-                <w:color w:val="000000"/>
+                <w:color w:val="333333"/>
                 <w:sz w:val="22"/>
                 <w:szCs w:val="22"/>
               </w:rPr>
@@ -261,25 +261,22 @@
         </w:tc>
         <w:tc>
           <w:tcPr>
-            <w:tcW w:type="dxa" w:w="7088"/>
-            <w:tcBorders>
-              <w:top w:val="single" w:color="AAAAAA" w:sz="4"/>
-              <w:left w:val="single" w:color="AAAAAA" w:sz="4"/>
-              <w:bottom w:val="single" w:color="AAAAAA" w:sz="4"/>
-              <w:right w:val="single" w:color="AAAAAA" w:sz="4"/>
+            <w:tcW w:type="dxa" w:w="7092"/>
+            <w:tcBorders>
+              <w:top w:val="single" w:color="CCCCCC" w:sz="4"/>
+              <w:left w:val="single" w:color="CCCCCC" w:sz="4"/>
+              <w:bottom w:val="single" w:color="CCCCCC" w:sz="4"/>
+              <w:right w:val="single" w:color="CCCCCC" w:sz="4"/>
             </w:tcBorders>
             <w:shd w:fill="FFFFFF" w:val="clear"/>
             <w:tcMar>
-              <w:top w:type="dxa" w:w="100"/>
-              <w:left w:type="dxa" w:w="160"/>
-              <w:bottom w:type="dxa" w:w="100"/>
-              <w:right w:type="dxa" w:w="160"/>
-            </w:tcMar>
-          </w:tcPr>
-          <w:p>
-            <w:pPr>
-              <w:jc w:val="left"/>
-            </w:pPr>
+              <w:top w:type="dxa" w:w="120"/>
+              <w:left w:type="dxa" w:w="160"/>
+              <w:bottom w:type="dxa" w:w="120"/>
+              <w:right w:type="dxa" w:w="160"/>
+            </w:tcMar>
+          </w:tcPr>
+          <w:p>
             <w:r>
               <w:rPr>
                 <w:rFonts w:ascii="Arial" w:cs="Arial" w:eastAsia="Arial" w:hAnsi="Arial"/>
@@ -287,7 +284,7 @@
                 <w:bCs w:val="false"/>
                 <w:i w:val="false"/>
                 <w:iCs w:val="false"/>
-                <w:color w:val="000000"/>
+                <w:color w:val="1C1C1C"/>
                 <w:sz w:val="22"/>
                 <w:szCs w:val="22"/>
               </w:rPr>
@@ -332,7 +329,10 @@
     </w:p>
     <w:p>
       <w:pPr>
-        <w:spacing w:after="80" w:before="80"/>
+        <w:pBdr>
+          <w:bottom w:val="single" w:color="EEEEEE" w:sz="4"/>
+        </w:pBdr>
+        <w:spacing w:after="200" w:before="200"/>
       </w:pPr>
       <w:r>
         <w:t xml:space="preserve"/>
@@ -340,66 +340,43 @@
     </w:p>
     <w:p>
       <w:pPr>
-        <w:spacing w:after="120" w:before="360"/>
+        <w:spacing w:after="120" w:before="320"/>
       </w:pPr>
       <w:r>
         <w:rPr>
           <w:rFonts w:ascii="Arial" w:cs="Arial" w:eastAsia="Arial" w:hAnsi="Arial"/>
           <w:b/>
           <w:bCs/>
-          <w:sz w:val="36"/>
-          <w:szCs w:val="36"/>
+          <w:color w:val="1C1C1C"/>
+          <w:sz w:val="28"/>
+          <w:szCs w:val="28"/>
           <w:u w:val="single"/>
         </w:rPr>
-        <w:t xml:space="preserve">1. Избор на тема</w:t>
-      </w:r>
-    </w:p>
-    <w:p>
-      <w:pPr>
-        <w:spacing w:after="160" w:before="60"/>
+        <w:t xml:space="preserve">1. Избор на сфера и формулиране на проблем</w:t>
+      </w:r>
+    </w:p>
+    <w:p>
+      <w:pPr>
+        <w:spacing w:after="120" w:before="60"/>
       </w:pPr>
       <w:r>
         <w:rPr>
           <w:rFonts w:ascii="Arial" w:cs="Arial" w:eastAsia="Arial" w:hAnsi="Arial"/>
           <w:i w:val="false"/>
           <w:iCs w:val="false"/>
-          <w:color w:val="000000"/>
-          <w:sz w:val="22"/>
-          <w:szCs w:val="22"/>
-        </w:rPr>
-        <w:t xml:space="preserve">Изберете реален проблем от вашия живот или работа, за който искате да намерите решение с помощта на AI.</w:t>
-      </w:r>
-    </w:p>
-    <w:p>
-      <w:pPr>
-        <w:spacing w:after="160" w:before="60"/>
-      </w:pPr>
-      <w:r>
-        <w:rPr>
-          <w:rFonts w:ascii="Arial" w:cs="Arial" w:eastAsia="Arial" w:hAnsi="Arial"/>
-          <w:i/>
-          <w:iCs/>
-          <w:color w:val="000000"/>
-          <w:sz w:val="22"/>
-          <w:szCs w:val="22"/>
-        </w:rPr>
-        <w:t xml:space="preserve">Можете да изберете и собствена тема.</w:t>
-      </w:r>
-    </w:p>
-    <w:p>
-      <w:pPr>
-        <w:spacing w:after="160" w:before="60"/>
-      </w:pPr>
-      <w:r>
-        <w:rPr>
-          <w:rFonts w:ascii="Arial" w:cs="Arial" w:eastAsia="Arial" w:hAnsi="Arial"/>
-          <w:i w:val="false"/>
-          <w:iCs w:val="false"/>
-          <w:color w:val="000000"/>
-          <w:sz w:val="22"/>
-          <w:szCs w:val="22"/>
-        </w:rPr>
-        <w:t xml:space="preserve">Попълнете таблицата:</w:t>
+          <w:color w:val="333333"/>
+          <w:sz w:val="22"/>
+          <w:szCs w:val="22"/>
+        </w:rPr>
+        <w:t xml:space="preserve">Изберете реален проблем от бизнес, организация, екип, общност или ваша професионална среда. Проблемът трябва да е конкретен и да може да бъде обяснен в 1-2 изречения.</w:t>
+      </w:r>
+    </w:p>
+    <w:p>
+      <w:pPr>
+        <w:spacing w:after="80" w:before="40"/>
+      </w:pPr>
+      <w:r>
+        <w:t xml:space="preserve"/>
       </w:r>
     </w:p>
     <w:tbl>
@@ -423,23 +400,20 @@
           <w:tcPr>
             <w:tcW w:type="dxa" w:w="2268"/>
             <w:tcBorders>
-              <w:top w:val="single" w:color="AAAAAA" w:sz="4"/>
-              <w:left w:val="single" w:color="AAAAAA" w:sz="4"/>
-              <w:bottom w:val="single" w:color="AAAAAA" w:sz="4"/>
-              <w:right w:val="single" w:color="AAAAAA" w:sz="4"/>
-            </w:tcBorders>
-            <w:shd w:fill="F2F2F2" w:val="clear"/>
-            <w:tcMar>
-              <w:top w:type="dxa" w:w="100"/>
-              <w:left w:type="dxa" w:w="160"/>
-              <w:bottom w:type="dxa" w:w="100"/>
-              <w:right w:type="dxa" w:w="160"/>
-            </w:tcMar>
-          </w:tcPr>
-          <w:p>
-            <w:pPr>
-              <w:jc w:val="left"/>
-            </w:pPr>
+              <w:top w:val="single" w:color="CCCCCC" w:sz="4"/>
+              <w:left w:val="single" w:color="CCCCCC" w:sz="4"/>
+              <w:bottom w:val="single" w:color="CCCCCC" w:sz="4"/>
+              <w:right w:val="single" w:color="CCCCCC" w:sz="4"/>
+            </w:tcBorders>
+            <w:shd w:fill="F5F5F5" w:val="clear"/>
+            <w:tcMar>
+              <w:top w:type="dxa" w:w="120"/>
+              <w:left w:type="dxa" w:w="160"/>
+              <w:bottom w:type="dxa" w:w="120"/>
+              <w:right w:type="dxa" w:w="160"/>
+            </w:tcMar>
+          </w:tcPr>
+          <w:p>
             <w:r>
               <w:rPr>
                 <w:rFonts w:ascii="Arial" w:cs="Arial" w:eastAsia="Arial" w:hAnsi="Arial"/>
@@ -447,7 +421,7 @@
                 <w:bCs/>
                 <w:i w:val="false"/>
                 <w:iCs w:val="false"/>
-                <w:color w:val="000000"/>
+                <w:color w:val="333333"/>
                 <w:sz w:val="22"/>
                 <w:szCs w:val="22"/>
               </w:rPr>
@@ -457,25 +431,22 @@
         </w:tc>
         <w:tc>
           <w:tcPr>
-            <w:tcW w:type="dxa" w:w="7088"/>
-            <w:tcBorders>
-              <w:top w:val="single" w:color="AAAAAA" w:sz="4"/>
-              <w:left w:val="single" w:color="AAAAAA" w:sz="4"/>
-              <w:bottom w:val="single" w:color="AAAAAA" w:sz="4"/>
-              <w:right w:val="single" w:color="AAAAAA" w:sz="4"/>
+            <w:tcW w:type="dxa" w:w="7092"/>
+            <w:tcBorders>
+              <w:top w:val="single" w:color="CCCCCC" w:sz="4"/>
+              <w:left w:val="single" w:color="CCCCCC" w:sz="4"/>
+              <w:bottom w:val="single" w:color="CCCCCC" w:sz="4"/>
+              <w:right w:val="single" w:color="CCCCCC" w:sz="4"/>
             </w:tcBorders>
             <w:shd w:fill="FFFFFF" w:val="clear"/>
             <w:tcMar>
-              <w:top w:type="dxa" w:w="100"/>
-              <w:left w:type="dxa" w:w="160"/>
-              <w:bottom w:type="dxa" w:w="100"/>
-              <w:right w:type="dxa" w:w="160"/>
-            </w:tcMar>
-          </w:tcPr>
-          <w:p>
-            <w:pPr>
-              <w:jc w:val="left"/>
-            </w:pPr>
+              <w:top w:type="dxa" w:w="120"/>
+              <w:left w:type="dxa" w:w="160"/>
+              <w:bottom w:type="dxa" w:w="120"/>
+              <w:right w:type="dxa" w:w="160"/>
+            </w:tcMar>
+          </w:tcPr>
+          <w:p>
             <w:r>
               <w:rPr>
                 <w:rFonts w:ascii="Arial" w:cs="Arial" w:eastAsia="Arial" w:hAnsi="Arial"/>
@@ -483,7 +454,7 @@
                 <w:bCs w:val="false"/>
                 <w:i w:val="false"/>
                 <w:iCs w:val="false"/>
-                <w:color w:val="000000"/>
+                <w:color w:val="1C1C1C"/>
                 <w:sz w:val="22"/>
                 <w:szCs w:val="22"/>
               </w:rPr>
@@ -497,23 +468,20 @@
           <w:tcPr>
             <w:tcW w:type="dxa" w:w="2268"/>
             <w:tcBorders>
-              <w:top w:val="single" w:color="AAAAAA" w:sz="4"/>
-              <w:left w:val="single" w:color="AAAAAA" w:sz="4"/>
-              <w:bottom w:val="single" w:color="AAAAAA" w:sz="4"/>
-              <w:right w:val="single" w:color="AAAAAA" w:sz="4"/>
-            </w:tcBorders>
-            <w:shd w:fill="F2F2F2" w:val="clear"/>
-            <w:tcMar>
-              <w:top w:type="dxa" w:w="100"/>
-              <w:left w:type="dxa" w:w="160"/>
-              <w:bottom w:type="dxa" w:w="100"/>
-              <w:right w:type="dxa" w:w="160"/>
-            </w:tcMar>
-          </w:tcPr>
-          <w:p>
-            <w:pPr>
-              <w:jc w:val="left"/>
-            </w:pPr>
+              <w:top w:val="single" w:color="CCCCCC" w:sz="4"/>
+              <w:left w:val="single" w:color="CCCCCC" w:sz="4"/>
+              <w:bottom w:val="single" w:color="CCCCCC" w:sz="4"/>
+              <w:right w:val="single" w:color="CCCCCC" w:sz="4"/>
+            </w:tcBorders>
+            <w:shd w:fill="F5F5F5" w:val="clear"/>
+            <w:tcMar>
+              <w:top w:type="dxa" w:w="120"/>
+              <w:left w:type="dxa" w:w="160"/>
+              <w:bottom w:type="dxa" w:w="120"/>
+              <w:right w:type="dxa" w:w="160"/>
+            </w:tcMar>
+          </w:tcPr>
+          <w:p>
             <w:r>
               <w:rPr>
                 <w:rFonts w:ascii="Arial" w:cs="Arial" w:eastAsia="Arial" w:hAnsi="Arial"/>
@@ -521,7 +489,7 @@
                 <w:bCs/>
                 <w:i w:val="false"/>
                 <w:iCs w:val="false"/>
-                <w:color w:val="000000"/>
+                <w:color w:val="333333"/>
                 <w:sz w:val="22"/>
                 <w:szCs w:val="22"/>
               </w:rPr>
@@ -531,25 +499,22 @@
         </w:tc>
         <w:tc>
           <w:tcPr>
-            <w:tcW w:type="dxa" w:w="7088"/>
-            <w:tcBorders>
-              <w:top w:val="single" w:color="AAAAAA" w:sz="4"/>
-              <w:left w:val="single" w:color="AAAAAA" w:sz="4"/>
-              <w:bottom w:val="single" w:color="AAAAAA" w:sz="4"/>
-              <w:right w:val="single" w:color="AAAAAA" w:sz="4"/>
+            <w:tcW w:type="dxa" w:w="7092"/>
+            <w:tcBorders>
+              <w:top w:val="single" w:color="CCCCCC" w:sz="4"/>
+              <w:left w:val="single" w:color="CCCCCC" w:sz="4"/>
+              <w:bottom w:val="single" w:color="CCCCCC" w:sz="4"/>
+              <w:right w:val="single" w:color="CCCCCC" w:sz="4"/>
             </w:tcBorders>
             <w:shd w:fill="FFFFFF" w:val="clear"/>
             <w:tcMar>
-              <w:top w:type="dxa" w:w="100"/>
-              <w:left w:type="dxa" w:w="160"/>
-              <w:bottom w:type="dxa" w:w="100"/>
-              <w:right w:type="dxa" w:w="160"/>
-            </w:tcMar>
-          </w:tcPr>
-          <w:p>
-            <w:pPr>
-              <w:jc w:val="left"/>
-            </w:pPr>
+              <w:top w:type="dxa" w:w="120"/>
+              <w:left w:type="dxa" w:w="160"/>
+              <w:bottom w:type="dxa" w:w="120"/>
+              <w:right w:type="dxa" w:w="160"/>
+            </w:tcMar>
+          </w:tcPr>
+          <w:p>
             <w:r>
               <w:rPr>
                 <w:rFonts w:ascii="Arial" w:cs="Arial" w:eastAsia="Arial" w:hAnsi="Arial"/>
@@ -557,11 +522,11 @@
                 <w:bCs w:val="false"/>
                 <w:i w:val="false"/>
                 <w:iCs w:val="false"/>
-                <w:color w:val="000000"/>
-                <w:sz w:val="22"/>
-                <w:szCs w:val="22"/>
-              </w:rPr>
-              <w:t xml:space="preserve">Фитнес клуб FitZone (кв. Люлин, София) — 7 години работа, нулево онлайн присъствие. Клиентите се намират само по препоръка. Нужна е проста уебстраница с услуги, цени в EUR и форма за запис.</w:t>
+                <w:color w:val="1C1C1C"/>
+                <w:sz w:val="22"/>
+                <w:szCs w:val="22"/>
+              </w:rPr>
+              <w:t xml:space="preserve">Фитнес клуб FitZone (кв. Люлин, София) работи 7 години без онлайн присъствие. Клиентите го намират само по препоръка от квартала. Необходима е уебстраница с услуги, цени в EUR, форма за запис и локация.</w:t>
             </w:r>
           </w:p>
         </w:tc>
@@ -569,7 +534,10 @@
     </w:tbl>
     <w:p>
       <w:pPr>
-        <w:spacing w:after="80" w:before="80"/>
+        <w:pBdr>
+          <w:bottom w:val="single" w:color="EEEEEE" w:sz="4"/>
+        </w:pBdr>
+        <w:spacing w:after="200" w:before="200"/>
       </w:pPr>
       <w:r>
         <w:t xml:space="preserve"/>
@@ -577,15 +545,16 @@
     </w:p>
     <w:p>
       <w:pPr>
-        <w:spacing w:after="120" w:before="360"/>
+        <w:spacing w:after="120" w:before="320"/>
       </w:pPr>
       <w:r>
         <w:rPr>
           <w:rFonts w:ascii="Arial" w:cs="Arial" w:eastAsia="Arial" w:hAnsi="Arial"/>
           <w:b/>
           <w:bCs/>
-          <w:sz w:val="36"/>
-          <w:szCs w:val="36"/>
+          <w:color w:val="1C1C1C"/>
+          <w:sz w:val="28"/>
+          <w:szCs w:val="28"/>
           <w:u w:val="single"/>
         </w:rPr>
         <w:t xml:space="preserve">2. Генериране на решение с AI асистент</w:t>
@@ -593,50 +562,42 @@
     </w:p>
     <w:p>
       <w:pPr>
-        <w:spacing w:after="160" w:before="60"/>
+        <w:spacing w:after="120" w:before="60"/>
       </w:pPr>
       <w:r>
         <w:rPr>
           <w:rFonts w:ascii="Arial" w:cs="Arial" w:eastAsia="Arial" w:hAnsi="Arial"/>
           <w:i w:val="false"/>
           <w:iCs w:val="false"/>
-          <w:color w:val="000000"/>
-          <w:sz w:val="22"/>
-          <w:szCs w:val="22"/>
-        </w:rPr>
-        <w:t xml:space="preserve">Опишете проблема на AI асистента и поискайте предложение за просто, приложимо решение. В промпта включете кой има проблема, какво му пречи и какъв тип резултат очаквате.</w:t>
-      </w:r>
-    </w:p>
-    <w:p>
-      <w:pPr>
-        <w:spacing w:after="160" w:before="60"/>
+          <w:color w:val="333333"/>
+          <w:sz w:val="22"/>
+          <w:szCs w:val="22"/>
+        </w:rPr>
+        <w:t xml:space="preserve">Описах проблема на Claude и поисках предложение за просто, приложимо решение. В промпта включих кой има проблема, какво му пречи и какъв тип резултат очаквам.</w:t>
+      </w:r>
+    </w:p>
+    <w:p>
+      <w:pPr>
+        <w:spacing w:after="120" w:before="60"/>
       </w:pPr>
       <w:r>
         <w:rPr>
           <w:rFonts w:ascii="Arial" w:cs="Arial" w:eastAsia="Arial" w:hAnsi="Arial"/>
           <w:i/>
           <w:iCs/>
-          <w:color w:val="000000"/>
-          <w:sz w:val="22"/>
-          <w:szCs w:val="22"/>
-        </w:rPr>
-        <w:t xml:space="preserve">Примерен промпт: „Работя по проблем в сферата на [сфера]. Проблемът е: [описание]. Предложи ми просто решение, обясни на кого помага и дай идеята в 5-6 изречения."</w:t>
-      </w:r>
-    </w:p>
-    <w:p>
-      <w:pPr>
-        <w:spacing w:after="160" w:before="60"/>
-      </w:pPr>
-      <w:r>
-        <w:rPr>
-          <w:rFonts w:ascii="Arial" w:cs="Arial" w:eastAsia="Arial" w:hAnsi="Arial"/>
-          <w:i w:val="false"/>
-          <w:iCs w:val="false"/>
-          <w:color w:val="000000"/>
-          <w:sz w:val="22"/>
-          <w:szCs w:val="22"/>
-        </w:rPr>
-        <w:t xml:space="preserve">Попълнете таблицата (поставете реалния промпт и резултата):</w:t>
+          <w:color w:val="333333"/>
+          <w:sz w:val="22"/>
+          <w:szCs w:val="22"/>
+        </w:rPr>
+        <w:t xml:space="preserve">Използван промпт формат: „Работя по проблем в сферата на [сфера]. Проблемът е: [описание]. Предложи ми просто решение, обясни на кого помага и дай идеята в 5-6 изречения."</w:t>
+      </w:r>
+    </w:p>
+    <w:p>
+      <w:pPr>
+        <w:spacing w:after="80" w:before="40"/>
+      </w:pPr>
+      <w:r>
+        <w:t xml:space="preserve"/>
       </w:r>
     </w:p>
     <w:tbl>
@@ -660,23 +621,20 @@
           <w:tcPr>
             <w:tcW w:type="dxa" w:w="2268"/>
             <w:tcBorders>
-              <w:top w:val="single" w:color="AAAAAA" w:sz="4"/>
-              <w:left w:val="single" w:color="AAAAAA" w:sz="4"/>
-              <w:bottom w:val="single" w:color="AAAAAA" w:sz="4"/>
-              <w:right w:val="single" w:color="AAAAAA" w:sz="4"/>
-            </w:tcBorders>
-            <w:shd w:fill="F2F2F2" w:val="clear"/>
-            <w:tcMar>
-              <w:top w:type="dxa" w:w="100"/>
-              <w:left w:type="dxa" w:w="160"/>
-              <w:bottom w:type="dxa" w:w="100"/>
-              <w:right w:type="dxa" w:w="160"/>
-            </w:tcMar>
-          </w:tcPr>
-          <w:p>
-            <w:pPr>
-              <w:jc w:val="left"/>
-            </w:pPr>
+              <w:top w:val="single" w:color="CCCCCC" w:sz="4"/>
+              <w:left w:val="single" w:color="CCCCCC" w:sz="4"/>
+              <w:bottom w:val="single" w:color="CCCCCC" w:sz="4"/>
+              <w:right w:val="single" w:color="CCCCCC" w:sz="4"/>
+            </w:tcBorders>
+            <w:shd w:fill="F5F5F5" w:val="clear"/>
+            <w:tcMar>
+              <w:top w:type="dxa" w:w="120"/>
+              <w:left w:type="dxa" w:w="160"/>
+              <w:bottom w:type="dxa" w:w="120"/>
+              <w:right w:type="dxa" w:w="160"/>
+            </w:tcMar>
+          </w:tcPr>
+          <w:p>
             <w:r>
               <w:rPr>
                 <w:rFonts w:ascii="Arial" w:cs="Arial" w:eastAsia="Arial" w:hAnsi="Arial"/>
@@ -684,7 +642,7 @@
                 <w:bCs/>
                 <w:i w:val="false"/>
                 <w:iCs w:val="false"/>
-                <w:color w:val="000000"/>
+                <w:color w:val="333333"/>
                 <w:sz w:val="22"/>
                 <w:szCs w:val="22"/>
               </w:rPr>
@@ -694,25 +652,22 @@
         </w:tc>
         <w:tc>
           <w:tcPr>
-            <w:tcW w:type="dxa" w:w="7088"/>
-            <w:tcBorders>
-              <w:top w:val="single" w:color="AAAAAA" w:sz="4"/>
-              <w:left w:val="single" w:color="AAAAAA" w:sz="4"/>
-              <w:bottom w:val="single" w:color="AAAAAA" w:sz="4"/>
-              <w:right w:val="single" w:color="AAAAAA" w:sz="4"/>
+            <w:tcW w:type="dxa" w:w="7092"/>
+            <w:tcBorders>
+              <w:top w:val="single" w:color="CCCCCC" w:sz="4"/>
+              <w:left w:val="single" w:color="CCCCCC" w:sz="4"/>
+              <w:bottom w:val="single" w:color="CCCCCC" w:sz="4"/>
+              <w:right w:val="single" w:color="CCCCCC" w:sz="4"/>
             </w:tcBorders>
             <w:shd w:fill="FFFFFF" w:val="clear"/>
             <w:tcMar>
-              <w:top w:type="dxa" w:w="100"/>
-              <w:left w:type="dxa" w:w="160"/>
-              <w:bottom w:type="dxa" w:w="100"/>
-              <w:right w:type="dxa" w:w="160"/>
-            </w:tcMar>
-          </w:tcPr>
-          <w:p>
-            <w:pPr>
-              <w:jc w:val="left"/>
-            </w:pPr>
+              <w:top w:type="dxa" w:w="120"/>
+              <w:left w:type="dxa" w:w="160"/>
+              <w:bottom w:type="dxa" w:w="120"/>
+              <w:right w:type="dxa" w:w="160"/>
+            </w:tcMar>
+          </w:tcPr>
+          <w:p>
             <w:r>
               <w:rPr>
                 <w:rFonts w:ascii="Arial" w:cs="Arial" w:eastAsia="Arial" w:hAnsi="Arial"/>
@@ -720,11 +675,11 @@
                 <w:bCs w:val="false"/>
                 <w:i w:val="false"/>
                 <w:iCs w:val="false"/>
-                <w:color w:val="000000"/>
-                <w:sz w:val="22"/>
-                <w:szCs w:val="22"/>
-              </w:rPr>
-              <w:t xml:space="preserve">Работя по проблем в сферата на малкия бизнес / услуги. Проблемът е: Имам малък фитнес клуб в кв. Люлин, София (бул. Царица Йоанна 47), работещ вече 7 години, но без никакво онлайн присъствие — нямам уебсайт, намират ме само хора от квартала по препоръка. Искам потенциалните клиенти да могат да намерят информация за услугите ми (фитнес зала, кардио, групови тренировки, личен треньор), цените (от 5 EUR/посещение до 306 EUR/год.), работното време и да се запишат за безплатна пробна тренировка. Предложи ми просто решение, обясни на кого помага и дай идеята в 5-6 изречения.</w:t>
+                <w:color w:val="1C1C1C"/>
+                <w:sz w:val="22"/>
+                <w:szCs w:val="22"/>
+              </w:rPr>
+              <w:t xml:space="preserve">Работя по проблем в сферата на малкия бизнес / фитнес услуги. Проблемът е: Имам малък фитнес клуб FitZone в кв. Люлин, София (бул. Царица Йоанна 47), работещ вече 7 години, без никакво онлайн присъствие — нямам уебсайт, намират ме само хора от квартала по препоръка. Искам потенциалните клиенти да намират информация за услугите ми (фитнес зала, кардио, групови тренировки, личен треньор), цените (от €5/посещение до €306/год.), работното време и да се запишат за безплатна пробна тренировка онлайн. Предложи ми просто решение, обясни на кого помага и дай идеята в 5-6 изречения.</w:t>
             </w:r>
           </w:p>
         </w:tc>
@@ -734,23 +689,20 @@
           <w:tcPr>
             <w:tcW w:type="dxa" w:w="2268"/>
             <w:tcBorders>
-              <w:top w:val="single" w:color="AAAAAA" w:sz="4"/>
-              <w:left w:val="single" w:color="AAAAAA" w:sz="4"/>
-              <w:bottom w:val="single" w:color="AAAAAA" w:sz="4"/>
-              <w:right w:val="single" w:color="AAAAAA" w:sz="4"/>
-            </w:tcBorders>
-            <w:shd w:fill="F2F2F2" w:val="clear"/>
-            <w:tcMar>
-              <w:top w:type="dxa" w:w="100"/>
-              <w:left w:type="dxa" w:w="160"/>
-              <w:bottom w:type="dxa" w:w="100"/>
-              <w:right w:type="dxa" w:w="160"/>
-            </w:tcMar>
-          </w:tcPr>
-          <w:p>
-            <w:pPr>
-              <w:jc w:val="left"/>
-            </w:pPr>
+              <w:top w:val="single" w:color="CCCCCC" w:sz="4"/>
+              <w:left w:val="single" w:color="CCCCCC" w:sz="4"/>
+              <w:bottom w:val="single" w:color="CCCCCC" w:sz="4"/>
+              <w:right w:val="single" w:color="CCCCCC" w:sz="4"/>
+            </w:tcBorders>
+            <w:shd w:fill="F5F5F5" w:val="clear"/>
+            <w:tcMar>
+              <w:top w:type="dxa" w:w="120"/>
+              <w:left w:type="dxa" w:w="160"/>
+              <w:bottom w:type="dxa" w:w="120"/>
+              <w:right w:type="dxa" w:w="160"/>
+            </w:tcMar>
+          </w:tcPr>
+          <w:p>
             <w:r>
               <w:rPr>
                 <w:rFonts w:ascii="Arial" w:cs="Arial" w:eastAsia="Arial" w:hAnsi="Arial"/>
@@ -758,7 +710,7 @@
                 <w:bCs/>
                 <w:i w:val="false"/>
                 <w:iCs w:val="false"/>
-                <w:color w:val="000000"/>
+                <w:color w:val="333333"/>
                 <w:sz w:val="22"/>
                 <w:szCs w:val="22"/>
               </w:rPr>
@@ -768,25 +720,22 @@
         </w:tc>
         <w:tc>
           <w:tcPr>
-            <w:tcW w:type="dxa" w:w="7088"/>
-            <w:tcBorders>
-              <w:top w:val="single" w:color="AAAAAA" w:sz="4"/>
-              <w:left w:val="single" w:color="AAAAAA" w:sz="4"/>
-              <w:bottom w:val="single" w:color="AAAAAA" w:sz="4"/>
-              <w:right w:val="single" w:color="AAAAAA" w:sz="4"/>
+            <w:tcW w:type="dxa" w:w="7092"/>
+            <w:tcBorders>
+              <w:top w:val="single" w:color="CCCCCC" w:sz="4"/>
+              <w:left w:val="single" w:color="CCCCCC" w:sz="4"/>
+              <w:bottom w:val="single" w:color="CCCCCC" w:sz="4"/>
+              <w:right w:val="single" w:color="CCCCCC" w:sz="4"/>
             </w:tcBorders>
             <w:shd w:fill="FFFFFF" w:val="clear"/>
             <w:tcMar>
-              <w:top w:type="dxa" w:w="100"/>
-              <w:left w:type="dxa" w:w="160"/>
-              <w:bottom w:type="dxa" w:w="100"/>
-              <w:right w:type="dxa" w:w="160"/>
-            </w:tcMar>
-          </w:tcPr>
-          <w:p>
-            <w:pPr>
-              <w:jc w:val="left"/>
-            </w:pPr>
+              <w:top w:type="dxa" w:w="120"/>
+              <w:left w:type="dxa" w:w="160"/>
+              <w:bottom w:type="dxa" w:w="120"/>
+              <w:right w:type="dxa" w:w="160"/>
+            </w:tcMar>
+          </w:tcPr>
+          <w:p>
             <w:r>
               <w:rPr>
                 <w:rFonts w:ascii="Arial" w:cs="Arial" w:eastAsia="Arial" w:hAnsi="Arial"/>
@@ -794,11 +743,11 @@
                 <w:bCs w:val="false"/>
                 <w:i w:val="false"/>
                 <w:iCs w:val="false"/>
-                <w:color w:val="000000"/>
-                <w:sz w:val="22"/>
-                <w:szCs w:val="22"/>
-              </w:rPr>
-              <w:t xml:space="preserve">Предложеното решение е създаването на проста едностранична уебстраница (landing page) за FitZone, която съдържа меню с услуги, ценоразпис в EUR, седмична програма на груповите тренировки, форма за запис за безплатна пробна тренировка, интерактивна Google Maps карта и информация за локация с работно време. Страницата помага на хора от квартала и около него, които търсят фитнес клуб в Google — те ще могат да намерят клуба, да разберат какво се предлага и на каква цена в евро, и да се запишат за пробна тренировка без да се налага да се обаждат. Страницата е статична (само HTML/CSS/JS), хоствана безплатно в GitHub Pages, лесна за поддържане и може да се надгради с онлайн резервации при нужда. Редизайнът следва UI/UX Pro Max Skill — Vibrant &amp; Block-based стил с оранжево-зелена цветова схема (#F97316 / #22C55E) на тъмен фон, подходящ за спортни брандове. Решението е приложимо веднага, без техническа поддръжка и без месечен разход.</w:t>
+                <w:color w:val="1C1C1C"/>
+                <w:sz w:val="22"/>
+                <w:szCs w:val="22"/>
+              </w:rPr>
+              <w:t xml:space="preserve">Решението е едностранична уебстраница (landing page) за FitZone с секции: Hero с ключово послание, Услуги (4 карти), Цени в EUR (4 плана), Седмична програма на груповите тренировки, Форма за безплатна пробна тренировка, Google Maps с реалната локация и контакти. Страницата помага на хора от квартала, търсещи фитнес клуб в Google — виждат всичко необходимо и се записват без да се обаждат. Редизайнът следва UI/UX Pro Max Skill (Vibrant &amp; Block-based: оранжево #F97316 + зелено #22C55E на тъмен фон), оптимизирана за мобилни устройства с hamburger меню. Хоствана безплатно в GitHub Pages, без месечен разход.</w:t>
             </w:r>
           </w:p>
         </w:tc>
@@ -808,23 +757,20 @@
           <w:tcPr>
             <w:tcW w:type="dxa" w:w="2268"/>
             <w:tcBorders>
-              <w:top w:val="single" w:color="AAAAAA" w:sz="4"/>
-              <w:left w:val="single" w:color="AAAAAA" w:sz="4"/>
-              <w:bottom w:val="single" w:color="AAAAAA" w:sz="4"/>
-              <w:right w:val="single" w:color="AAAAAA" w:sz="4"/>
-            </w:tcBorders>
-            <w:shd w:fill="F2F2F2" w:val="clear"/>
-            <w:tcMar>
-              <w:top w:type="dxa" w:w="100"/>
-              <w:left w:type="dxa" w:w="160"/>
-              <w:bottom w:type="dxa" w:w="100"/>
-              <w:right w:type="dxa" w:w="160"/>
-            </w:tcMar>
-          </w:tcPr>
-          <w:p>
-            <w:pPr>
-              <w:jc w:val="left"/>
-            </w:pPr>
+              <w:top w:val="single" w:color="CCCCCC" w:sz="4"/>
+              <w:left w:val="single" w:color="CCCCCC" w:sz="4"/>
+              <w:bottom w:val="single" w:color="CCCCCC" w:sz="4"/>
+              <w:right w:val="single" w:color="CCCCCC" w:sz="4"/>
+            </w:tcBorders>
+            <w:shd w:fill="F5F5F5" w:val="clear"/>
+            <w:tcMar>
+              <w:top w:type="dxa" w:w="120"/>
+              <w:left w:type="dxa" w:w="160"/>
+              <w:bottom w:type="dxa" w:w="120"/>
+              <w:right w:type="dxa" w:w="160"/>
+            </w:tcMar>
+          </w:tcPr>
+          <w:p>
             <w:r>
               <w:rPr>
                 <w:rFonts w:ascii="Arial" w:cs="Arial" w:eastAsia="Arial" w:hAnsi="Arial"/>
@@ -832,7 +778,7 @@
                 <w:bCs/>
                 <w:i w:val="false"/>
                 <w:iCs w:val="false"/>
-                <w:color w:val="000000"/>
+                <w:color w:val="333333"/>
                 <w:sz w:val="22"/>
                 <w:szCs w:val="22"/>
               </w:rPr>
@@ -842,25 +788,22 @@
         </w:tc>
         <w:tc>
           <w:tcPr>
-            <w:tcW w:type="dxa" w:w="7088"/>
-            <w:tcBorders>
-              <w:top w:val="single" w:color="AAAAAA" w:sz="4"/>
-              <w:left w:val="single" w:color="AAAAAA" w:sz="4"/>
-              <w:bottom w:val="single" w:color="AAAAAA" w:sz="4"/>
-              <w:right w:val="single" w:color="AAAAAA" w:sz="4"/>
+            <w:tcW w:type="dxa" w:w="7092"/>
+            <w:tcBorders>
+              <w:top w:val="single" w:color="CCCCCC" w:sz="4"/>
+              <w:left w:val="single" w:color="CCCCCC" w:sz="4"/>
+              <w:bottom w:val="single" w:color="CCCCCC" w:sz="4"/>
+              <w:right w:val="single" w:color="CCCCCC" w:sz="4"/>
             </w:tcBorders>
             <w:shd w:fill="FFFFFF" w:val="clear"/>
             <w:tcMar>
-              <w:top w:type="dxa" w:w="100"/>
-              <w:left w:type="dxa" w:w="160"/>
-              <w:bottom w:type="dxa" w:w="100"/>
-              <w:right w:type="dxa" w:w="160"/>
-            </w:tcMar>
-          </w:tcPr>
-          <w:p>
-            <w:pPr>
-              <w:jc w:val="left"/>
-            </w:pPr>
+              <w:top w:type="dxa" w:w="120"/>
+              <w:left w:type="dxa" w:w="160"/>
+              <w:bottom w:type="dxa" w:w="120"/>
+              <w:right w:type="dxa" w:w="160"/>
+            </w:tcMar>
+          </w:tcPr>
+          <w:p>
             <w:r>
               <w:rPr>
                 <w:rFonts w:ascii="Arial" w:cs="Arial" w:eastAsia="Arial" w:hAnsi="Arial"/>
@@ -868,7 +811,7 @@
                 <w:bCs w:val="false"/>
                 <w:i w:val="false"/>
                 <w:iCs w:val="false"/>
-                <w:color w:val="000000"/>
+                <w:color w:val="1C1C1C"/>
                 <w:sz w:val="22"/>
                 <w:szCs w:val="22"/>
               </w:rPr>
@@ -880,7 +823,10 @@
     </w:tbl>
     <w:p>
       <w:pPr>
-        <w:spacing w:after="80" w:before="80"/>
+        <w:pBdr>
+          <w:bottom w:val="single" w:color="EEEEEE" w:sz="4"/>
+        </w:pBdr>
+        <w:spacing w:after="200" w:before="200"/>
       </w:pPr>
       <w:r>
         <w:t xml:space="preserve"/>
@@ -888,15 +834,16 @@
     </w:p>
     <w:p>
       <w:pPr>
-        <w:spacing w:after="120" w:before="360"/>
+        <w:spacing w:after="120" w:before="320"/>
       </w:pPr>
       <w:r>
         <w:rPr>
           <w:rFonts w:ascii="Arial" w:cs="Arial" w:eastAsia="Arial" w:hAnsi="Arial"/>
           <w:b/>
           <w:bCs/>
-          <w:sz w:val="36"/>
-          <w:szCs w:val="36"/>
+          <w:color w:val="1C1C1C"/>
+          <w:sz w:val="28"/>
+          <w:szCs w:val="28"/>
           <w:u w:val="single"/>
         </w:rPr>
         <w:t xml:space="preserve">3. Създаване на уебстраница с AI</w:t>
@@ -904,34 +851,218 @@
     </w:p>
     <w:p>
       <w:pPr>
-        <w:spacing w:after="160" w:before="60"/>
+        <w:spacing w:after="120" w:before="60"/>
       </w:pPr>
       <w:r>
         <w:rPr>
           <w:rFonts w:ascii="Arial" w:cs="Arial" w:eastAsia="Arial" w:hAnsi="Arial"/>
           <w:i w:val="false"/>
           <w:iCs w:val="false"/>
-          <w:color w:val="000000"/>
-          <w:sz w:val="22"/>
-          <w:szCs w:val="22"/>
-        </w:rPr>
-        <w:t xml:space="preserve">Използвайте Claude, за да генерирате проста HTML уебстраница, която представя решението. Страницата трябва да съдържа: заглавие, описание на проблема и решението, и поне един призив за действие (бутон, форма или линк).</w:t>
-      </w:r>
-    </w:p>
-    <w:p>
-      <w:pPr>
-        <w:spacing w:after="160" w:before="60"/>
+          <w:color w:val="333333"/>
+          <w:sz w:val="22"/>
+          <w:szCs w:val="22"/>
+        </w:rPr>
+        <w:t xml:space="preserve">Използвах Claude за генериране на HTML страница, представяща решението. Страницата е разбираема за потенциален потребител дори без технически познания.</w:t>
+      </w:r>
+    </w:p>
+    <w:p>
+      <w:pPr>
+        <w:spacing w:after="40" w:before="40"/>
+      </w:pPr>
+      <w:r>
+        <w:t xml:space="preserve"/>
+      </w:r>
+    </w:p>
+    <w:p>
+      <w:pPr>
+        <w:spacing w:after="120" w:before="60"/>
       </w:pPr>
       <w:r>
         <w:rPr>
           <w:rFonts w:ascii="Arial" w:cs="Arial" w:eastAsia="Arial" w:hAnsi="Arial"/>
           <w:i w:val="false"/>
           <w:iCs w:val="false"/>
-          <w:color w:val="000000"/>
-          <w:sz w:val="22"/>
-          <w:szCs w:val="22"/>
-        </w:rPr>
-        <w:t xml:space="preserve">Публикувайте страницата (GitHub Pages, Netlify и т.н.) и поставете линка по-долу:</w:t>
+          <w:color w:val="1C1C1C"/>
+          <w:sz w:val="22"/>
+          <w:szCs w:val="22"/>
+        </w:rPr>
+        <w:t xml:space="preserve">Изпълнени минимални изисквания:</w:t>
+      </w:r>
+    </w:p>
+    <w:p>
+      <w:pPr>
+        <w:spacing w:after="40" w:before="40"/>
+        <w:ind w:left="360"/>
+      </w:pPr>
+      <w:r>
+        <w:rPr>
+          <w:rFonts w:ascii="Arial" w:cs="Arial" w:eastAsia="Arial" w:hAnsi="Arial"/>
+          <w:color w:val="F97316"/>
+          <w:sz w:val="22"/>
+          <w:szCs w:val="22"/>
+        </w:rPr>
+        <w:t xml:space="preserve">• </w:t>
+      </w:r>
+      <w:r>
+        <w:rPr>
+          <w:rFonts w:ascii="Arial" w:cs="Arial" w:eastAsia="Arial" w:hAnsi="Arial"/>
+          <w:color w:val="333333"/>
+          <w:sz w:val="22"/>
+          <w:szCs w:val="22"/>
+        </w:rPr>
+        <w:t xml:space="preserve">Заглавие с кратко и ясно послание ("Тренирай без компромис")</w:t>
+      </w:r>
+    </w:p>
+    <w:p>
+      <w:pPr>
+        <w:spacing w:after="40" w:before="40"/>
+        <w:ind w:left="360"/>
+      </w:pPr>
+      <w:r>
+        <w:rPr>
+          <w:rFonts w:ascii="Arial" w:cs="Arial" w:eastAsia="Arial" w:hAnsi="Arial"/>
+          <w:color w:val="F97316"/>
+          <w:sz w:val="22"/>
+          <w:szCs w:val="22"/>
+        </w:rPr>
+        <w:t xml:space="preserve">• </w:t>
+      </w:r>
+      <w:r>
+        <w:rPr>
+          <w:rFonts w:ascii="Arial" w:cs="Arial" w:eastAsia="Arial" w:hAnsi="Arial"/>
+          <w:color w:val="333333"/>
+          <w:sz w:val="22"/>
+          <w:szCs w:val="22"/>
+        </w:rPr>
+        <w:t xml:space="preserve">Кратко обяснение на проблема и решението</w:t>
+      </w:r>
+    </w:p>
+    <w:p>
+      <w:pPr>
+        <w:spacing w:after="40" w:before="40"/>
+        <w:ind w:left="360"/>
+      </w:pPr>
+      <w:r>
+        <w:rPr>
+          <w:rFonts w:ascii="Arial" w:cs="Arial" w:eastAsia="Arial" w:hAnsi="Arial"/>
+          <w:color w:val="F97316"/>
+          <w:sz w:val="22"/>
+          <w:szCs w:val="22"/>
+        </w:rPr>
+        <w:t xml:space="preserve">• </w:t>
+      </w:r>
+      <w:r>
+        <w:rPr>
+          <w:rFonts w:ascii="Arial" w:cs="Arial" w:eastAsia="Arial" w:hAnsi="Arial"/>
+          <w:color w:val="333333"/>
+          <w:sz w:val="22"/>
+          <w:szCs w:val="22"/>
+        </w:rPr>
+        <w:t xml:space="preserve">4 ключови услуги и 4 ценови плана в EUR</w:t>
+      </w:r>
+    </w:p>
+    <w:p>
+      <w:pPr>
+        <w:spacing w:after="40" w:before="40"/>
+        <w:ind w:left="360"/>
+      </w:pPr>
+      <w:r>
+        <w:rPr>
+          <w:rFonts w:ascii="Arial" w:cs="Arial" w:eastAsia="Arial" w:hAnsi="Arial"/>
+          <w:color w:val="F97316"/>
+          <w:sz w:val="22"/>
+          <w:szCs w:val="22"/>
+        </w:rPr>
+        <w:t xml:space="preserve">• </w:t>
+      </w:r>
+      <w:r>
+        <w:rPr>
+          <w:rFonts w:ascii="Arial" w:cs="Arial" w:eastAsia="Arial" w:hAnsi="Arial"/>
+          <w:color w:val="333333"/>
+          <w:sz w:val="22"/>
+          <w:szCs w:val="22"/>
+        </w:rPr>
+        <w:t xml:space="preserve">Форма за запис — призив за действие</w:t>
+      </w:r>
+    </w:p>
+    <w:p>
+      <w:pPr>
+        <w:spacing w:after="40" w:before="40"/>
+        <w:ind w:left="360"/>
+      </w:pPr>
+      <w:r>
+        <w:rPr>
+          <w:rFonts w:ascii="Arial" w:cs="Arial" w:eastAsia="Arial" w:hAnsi="Arial"/>
+          <w:color w:val="F97316"/>
+          <w:sz w:val="22"/>
+          <w:szCs w:val="22"/>
+        </w:rPr>
+        <w:t xml:space="preserve">• </w:t>
+      </w:r>
+      <w:r>
+        <w:rPr>
+          <w:rFonts w:ascii="Arial" w:cs="Arial" w:eastAsia="Arial" w:hAnsi="Arial"/>
+          <w:color w:val="333333"/>
+          <w:sz w:val="22"/>
+          <w:szCs w:val="22"/>
+        </w:rPr>
+        <w:t xml:space="preserve">Четим дизайн: Vibrant &amp; Block-based, тъмен фон, оранжев акцент</w:t>
+      </w:r>
+    </w:p>
+    <w:p>
+      <w:pPr>
+        <w:spacing w:after="40" w:before="40"/>
+        <w:ind w:left="360"/>
+      </w:pPr>
+      <w:r>
+        <w:rPr>
+          <w:rFonts w:ascii="Arial" w:cs="Arial" w:eastAsia="Arial" w:hAnsi="Arial"/>
+          <w:color w:val="F97316"/>
+          <w:sz w:val="22"/>
+          <w:szCs w:val="22"/>
+        </w:rPr>
+        <w:t xml:space="preserve">• </w:t>
+      </w:r>
+      <w:r>
+        <w:rPr>
+          <w:rFonts w:ascii="Arial" w:cs="Arial" w:eastAsia="Arial" w:hAnsi="Arial"/>
+          <w:color w:val="333333"/>
+          <w:sz w:val="22"/>
+          <w:szCs w:val="22"/>
+        </w:rPr>
+        <w:t xml:space="preserve">Мобилна оптимизация с hamburger меню</w:t>
+      </w:r>
+    </w:p>
+    <w:p>
+      <w:pPr>
+        <w:spacing w:after="40" w:before="40"/>
+        <w:ind w:left="360"/>
+      </w:pPr>
+      <w:r>
+        <w:rPr>
+          <w:rFonts w:ascii="Arial" w:cs="Arial" w:eastAsia="Arial" w:hAnsi="Arial"/>
+          <w:color w:val="F97316"/>
+          <w:sz w:val="22"/>
+          <w:szCs w:val="22"/>
+        </w:rPr>
+        <w:t xml:space="preserve">• </w:t>
+      </w:r>
+      <w:r>
+        <w:rPr>
+          <w:rFonts w:ascii="Arial" w:cs="Arial" w:eastAsia="Arial" w:hAnsi="Arial"/>
+          <w:color w:val="333333"/>
+          <w:sz w:val="22"/>
+          <w:szCs w:val="22"/>
+        </w:rPr>
+        <w:t xml:space="preserve">Google Maps embed с реалната локация</w:t>
+      </w:r>
+    </w:p>
+    <w:p>
+      <w:pPr>
+        <w:spacing w:after="80" w:before="80"/>
+      </w:pPr>
+      <w:r>
+        <w:t xml:space="preserve"/>
       </w:r>
     </w:p>
     <w:tbl>
@@ -955,23 +1086,20 @@
           <w:tcPr>
             <w:tcW w:type="dxa" w:w="2268"/>
             <w:tcBorders>
-              <w:top w:val="single" w:color="AAAAAA" w:sz="4"/>
-              <w:left w:val="single" w:color="AAAAAA" w:sz="4"/>
-              <w:bottom w:val="single" w:color="AAAAAA" w:sz="4"/>
-              <w:right w:val="single" w:color="AAAAAA" w:sz="4"/>
-            </w:tcBorders>
-            <w:shd w:fill="F2F2F2" w:val="clear"/>
-            <w:tcMar>
-              <w:top w:type="dxa" w:w="100"/>
-              <w:left w:type="dxa" w:w="160"/>
-              <w:bottom w:type="dxa" w:w="100"/>
-              <w:right w:type="dxa" w:w="160"/>
-            </w:tcMar>
-          </w:tcPr>
-          <w:p>
-            <w:pPr>
-              <w:jc w:val="left"/>
-            </w:pPr>
+              <w:top w:val="single" w:color="CCCCCC" w:sz="4"/>
+              <w:left w:val="single" w:color="CCCCCC" w:sz="4"/>
+              <w:bottom w:val="single" w:color="CCCCCC" w:sz="4"/>
+              <w:right w:val="single" w:color="CCCCCC" w:sz="4"/>
+            </w:tcBorders>
+            <w:shd w:fill="F5F5F5" w:val="clear"/>
+            <w:tcMar>
+              <w:top w:type="dxa" w:w="120"/>
+              <w:left w:type="dxa" w:w="160"/>
+              <w:bottom w:type="dxa" w:w="120"/>
+              <w:right w:type="dxa" w:w="160"/>
+            </w:tcMar>
+          </w:tcPr>
+          <w:p>
             <w:r>
               <w:rPr>
                 <w:rFonts w:ascii="Arial" w:cs="Arial" w:eastAsia="Arial" w:hAnsi="Arial"/>
@@ -979,35 +1107,32 @@
                 <w:bCs/>
                 <w:i w:val="false"/>
                 <w:iCs w:val="false"/>
-                <w:color w:val="000000"/>
-                <w:sz w:val="22"/>
-                <w:szCs w:val="22"/>
-              </w:rPr>
-              <w:t xml:space="preserve">Описание</w:t>
-            </w:r>
-          </w:p>
-        </w:tc>
-        <w:tc>
-          <w:tcPr>
-            <w:tcW w:type="dxa" w:w="7088"/>
-            <w:tcBorders>
-              <w:top w:val="single" w:color="AAAAAA" w:sz="4"/>
-              <w:left w:val="single" w:color="AAAAAA" w:sz="4"/>
-              <w:bottom w:val="single" w:color="AAAAAA" w:sz="4"/>
-              <w:right w:val="single" w:color="AAAAAA" w:sz="4"/>
+                <w:color w:val="333333"/>
+                <w:sz w:val="22"/>
+                <w:szCs w:val="22"/>
+              </w:rPr>
+              <w:t xml:space="preserve">Промпт за HTML</w:t>
+            </w:r>
+          </w:p>
+        </w:tc>
+        <w:tc>
+          <w:tcPr>
+            <w:tcW w:type="dxa" w:w="7092"/>
+            <w:tcBorders>
+              <w:top w:val="single" w:color="CCCCCC" w:sz="4"/>
+              <w:left w:val="single" w:color="CCCCCC" w:sz="4"/>
+              <w:bottom w:val="single" w:color="CCCCCC" w:sz="4"/>
+              <w:right w:val="single" w:color="CCCCCC" w:sz="4"/>
             </w:tcBorders>
             <w:shd w:fill="FFFFFF" w:val="clear"/>
             <w:tcMar>
-              <w:top w:type="dxa" w:w="100"/>
-              <w:left w:type="dxa" w:w="160"/>
-              <w:bottom w:type="dxa" w:w="100"/>
-              <w:right w:type="dxa" w:w="160"/>
-            </w:tcMar>
-          </w:tcPr>
-          <w:p>
-            <w:pPr>
-              <w:jc w:val="left"/>
-            </w:pPr>
+              <w:top w:type="dxa" w:w="120"/>
+              <w:left w:type="dxa" w:w="160"/>
+              <w:bottom w:type="dxa" w:w="120"/>
+              <w:right w:type="dxa" w:w="160"/>
+            </w:tcMar>
+          </w:tcPr>
+          <w:p>
             <w:r>
               <w:rPr>
                 <w:rFonts w:ascii="Arial" w:cs="Arial" w:eastAsia="Arial" w:hAnsi="Arial"/>
@@ -1015,11 +1140,11 @@
                 <w:bCs w:val="false"/>
                 <w:i w:val="false"/>
                 <w:iCs w:val="false"/>
-                <w:color w:val="000000"/>
-                <w:sz w:val="22"/>
-                <w:szCs w:val="22"/>
-              </w:rPr>
-              <w:t xml:space="preserve">Едностранична HTML уебстраница за FitZone - фитнес клуб в кв. Люлин. Секции: Hero, Услуги (4 карти), Цени в EUR (4 плана), Групови тренировки (6 занятия), Форма за запис, Google Maps карта, Локация. Редизайн по UI/UX Pro Max Skill.</w:t>
+                <w:color w:val="1C1C1C"/>
+                <w:sz w:val="22"/>
+                <w:szCs w:val="22"/>
+              </w:rPr>
+              <w:t xml:space="preserve">Направи ми красива, responsive едностранична HTML страница за фитнес клуб FitZone. Стил: Vibrant &amp; Block-based, тъмен фон #0F172A, оранжев акцент #F97316, зелен CTA #22C55E. Секции: Hero с H1 "Тренирай без компромис" + статистики, Услуги (4 карти), Цени в EUR (4 абонаментни плана), Групови тренировки (6 занятия), Форма за пробна тренировка, Google Maps embed, Footer. Мобилна оптимизация с hamburger меню. Шрифт: Barlow Condensed + Barlow от Google Fonts.</w:t>
             </w:r>
           </w:p>
         </w:tc>
@@ -1029,23 +1154,20 @@
           <w:tcPr>
             <w:tcW w:type="dxa" w:w="2268"/>
             <w:tcBorders>
-              <w:top w:val="single" w:color="AAAAAA" w:sz="4"/>
-              <w:left w:val="single" w:color="AAAAAA" w:sz="4"/>
-              <w:bottom w:val="single" w:color="AAAAAA" w:sz="4"/>
-              <w:right w:val="single" w:color="AAAAAA" w:sz="4"/>
-            </w:tcBorders>
-            <w:shd w:fill="F2F2F2" w:val="clear"/>
-            <w:tcMar>
-              <w:top w:type="dxa" w:w="100"/>
-              <w:left w:type="dxa" w:w="160"/>
-              <w:bottom w:type="dxa" w:w="100"/>
-              <w:right w:type="dxa" w:w="160"/>
-            </w:tcMar>
-          </w:tcPr>
-          <w:p>
-            <w:pPr>
-              <w:jc w:val="left"/>
-            </w:pPr>
+              <w:top w:val="single" w:color="CCCCCC" w:sz="4"/>
+              <w:left w:val="single" w:color="CCCCCC" w:sz="4"/>
+              <w:bottom w:val="single" w:color="CCCCCC" w:sz="4"/>
+              <w:right w:val="single" w:color="CCCCCC" w:sz="4"/>
+            </w:tcBorders>
+            <w:shd w:fill="F5F5F5" w:val="clear"/>
+            <w:tcMar>
+              <w:top w:type="dxa" w:w="120"/>
+              <w:left w:type="dxa" w:w="160"/>
+              <w:bottom w:type="dxa" w:w="120"/>
+              <w:right w:type="dxa" w:w="160"/>
+            </w:tcMar>
+          </w:tcPr>
+          <w:p>
             <w:r>
               <w:rPr>
                 <w:rFonts w:ascii="Arial" w:cs="Arial" w:eastAsia="Arial" w:hAnsi="Arial"/>
@@ -1053,35 +1175,32 @@
                 <w:bCs/>
                 <w:i w:val="false"/>
                 <w:iCs w:val="false"/>
-                <w:color w:val="000000"/>
-                <w:sz w:val="22"/>
-                <w:szCs w:val="22"/>
-              </w:rPr>
-              <w:t xml:space="preserve">Технология</w:t>
-            </w:r>
-          </w:p>
-        </w:tc>
-        <w:tc>
-          <w:tcPr>
-            <w:tcW w:type="dxa" w:w="7088"/>
-            <w:tcBorders>
-              <w:top w:val="single" w:color="AAAAAA" w:sz="4"/>
-              <w:left w:val="single" w:color="AAAAAA" w:sz="4"/>
-              <w:bottom w:val="single" w:color="AAAAAA" w:sz="4"/>
-              <w:right w:val="single" w:color="AAAAAA" w:sz="4"/>
+                <w:color w:val="333333"/>
+                <w:sz w:val="22"/>
+                <w:szCs w:val="22"/>
+              </w:rPr>
+              <w:t xml:space="preserve">Линк към страница</w:t>
+            </w:r>
+          </w:p>
+        </w:tc>
+        <w:tc>
+          <w:tcPr>
+            <w:tcW w:type="dxa" w:w="7092"/>
+            <w:tcBorders>
+              <w:top w:val="single" w:color="CCCCCC" w:sz="4"/>
+              <w:left w:val="single" w:color="CCCCCC" w:sz="4"/>
+              <w:bottom w:val="single" w:color="CCCCCC" w:sz="4"/>
+              <w:right w:val="single" w:color="CCCCCC" w:sz="4"/>
             </w:tcBorders>
             <w:shd w:fill="FFFFFF" w:val="clear"/>
             <w:tcMar>
-              <w:top w:type="dxa" w:w="100"/>
-              <w:left w:type="dxa" w:w="160"/>
-              <w:bottom w:type="dxa" w:w="100"/>
-              <w:right w:type="dxa" w:w="160"/>
-            </w:tcMar>
-          </w:tcPr>
-          <w:p>
-            <w:pPr>
-              <w:jc w:val="left"/>
-            </w:pPr>
+              <w:top w:type="dxa" w:w="120"/>
+              <w:left w:type="dxa" w:w="160"/>
+              <w:bottom w:type="dxa" w:w="120"/>
+              <w:right w:type="dxa" w:w="160"/>
+            </w:tcMar>
+          </w:tcPr>
+          <w:p>
             <w:r>
               <w:rPr>
                 <w:rFonts w:ascii="Arial" w:cs="Arial" w:eastAsia="Arial" w:hAnsi="Arial"/>
@@ -1089,11 +1208,104 @@
                 <w:bCs w:val="false"/>
                 <w:i w:val="false"/>
                 <w:iCs w:val="false"/>
-                <w:color w:val="000000"/>
-                <w:sz w:val="22"/>
-                <w:szCs w:val="22"/>
-              </w:rPr>
-              <w:t xml:space="preserve">HTML5 / CSS3 / JavaScript — без фреймуъркове. Хостван безплатно в GitHub Pages. Google Maps Embed API за карта.</w:t>
+                <w:color w:val="1C1C1C"/>
+                <w:sz w:val="22"/>
+                <w:szCs w:val="22"/>
+              </w:rPr>
+              <w:t xml:space="preserve">https://badmind.github.io/workshop_claude_agents_coursework/</w:t>
+            </w:r>
+          </w:p>
+        </w:tc>
+      </w:tr>
+    </w:tbl>
+    <w:p>
+      <w:pPr>
+        <w:spacing w:after="80" w:before="40"/>
+      </w:pPr>
+      <w:r>
+        <w:t xml:space="preserve"/>
+      </w:r>
+    </w:p>
+    <w:tbl>
+      <w:tblPr>
+        <w:tblW w:type="dxa" w:w="9360"/>
+        <w:tblBorders>
+          <w:top w:val="single" w:color="auto" w:sz="4"/>
+          <w:left w:val="single" w:color="auto" w:sz="4"/>
+          <w:bottom w:val="single" w:color="auto" w:sz="4"/>
+          <w:right w:val="single" w:color="auto" w:sz="4"/>
+          <w:insideH w:val="single" w:color="auto" w:sz="4"/>
+          <w:insideV w:val="single" w:color="auto" w:sz="4"/>
+        </w:tblBorders>
+      </w:tblPr>
+      <w:tblGrid>
+        <w:gridCol w:w="2268"/>
+        <w:gridCol w:w="7092"/>
+      </w:tblGrid>
+      <w:tr>
+        <w:tc>
+          <w:tcPr>
+            <w:tcW w:type="dxa" w:w="2268"/>
+            <w:tcBorders>
+              <w:top w:val="single" w:color="CCCCCC" w:sz="4"/>
+              <w:left w:val="single" w:color="CCCCCC" w:sz="4"/>
+              <w:bottom w:val="single" w:color="CCCCCC" w:sz="4"/>
+              <w:right w:val="single" w:color="CCCCCC" w:sz="4"/>
+            </w:tcBorders>
+            <w:shd w:fill="F5F5F5" w:val="clear"/>
+            <w:tcMar>
+              <w:top w:type="dxa" w:w="120"/>
+              <w:left w:type="dxa" w:w="160"/>
+              <w:bottom w:type="dxa" w:w="120"/>
+              <w:right w:type="dxa" w:w="160"/>
+            </w:tcMar>
+          </w:tcPr>
+          <w:p>
+            <w:r>
+              <w:rPr>
+                <w:rFonts w:ascii="Arial" w:cs="Arial" w:eastAsia="Arial" w:hAnsi="Arial"/>
+                <w:b/>
+                <w:bCs/>
+                <w:i w:val="false"/>
+                <w:iCs w:val="false"/>
+                <w:color w:val="333333"/>
+                <w:sz w:val="22"/>
+                <w:szCs w:val="22"/>
+              </w:rPr>
+              <w:t xml:space="preserve">Технология</w:t>
+            </w:r>
+          </w:p>
+        </w:tc>
+        <w:tc>
+          <w:tcPr>
+            <w:tcW w:type="dxa" w:w="7092"/>
+            <w:tcBorders>
+              <w:top w:val="single" w:color="CCCCCC" w:sz="4"/>
+              <w:left w:val="single" w:color="CCCCCC" w:sz="4"/>
+              <w:bottom w:val="single" w:color="CCCCCC" w:sz="4"/>
+              <w:right w:val="single" w:color="CCCCCC" w:sz="4"/>
+            </w:tcBorders>
+            <w:shd w:fill="FFFFFF" w:val="clear"/>
+            <w:tcMar>
+              <w:top w:type="dxa" w:w="120"/>
+              <w:left w:type="dxa" w:w="160"/>
+              <w:bottom w:type="dxa" w:w="120"/>
+              <w:right w:type="dxa" w:w="160"/>
+            </w:tcMar>
+          </w:tcPr>
+          <w:p>
+            <w:r>
+              <w:rPr>
+                <w:rFonts w:ascii="Arial" w:cs="Arial" w:eastAsia="Arial" w:hAnsi="Arial"/>
+                <w:b w:val="false"/>
+                <w:bCs w:val="false"/>
+                <w:i w:val="false"/>
+                <w:iCs w:val="false"/>
+                <w:color w:val="1C1C1C"/>
+                <w:sz w:val="22"/>
+                <w:szCs w:val="22"/>
+              </w:rPr>
+              <w:t xml:space="preserve">HTML5 / CSS3 / JavaScript — без фреймуъркове</w:t>
             </w:r>
           </w:p>
         </w:tc>
@@ -1103,23 +1315,20 @@
           <w:tcPr>
             <w:tcW w:type="dxa" w:w="2268"/>
             <w:tcBorders>
-              <w:top w:val="single" w:color="AAAAAA" w:sz="4"/>
-              <w:left w:val="single" w:color="AAAAAA" w:sz="4"/>
-              <w:bottom w:val="single" w:color="AAAAAA" w:sz="4"/>
-              <w:right w:val="single" w:color="AAAAAA" w:sz="4"/>
-            </w:tcBorders>
-            <w:shd w:fill="F2F2F2" w:val="clear"/>
-            <w:tcMar>
-              <w:top w:type="dxa" w:w="100"/>
-              <w:left w:type="dxa" w:w="160"/>
-              <w:bottom w:type="dxa" w:w="100"/>
-              <w:right w:type="dxa" w:w="160"/>
-            </w:tcMar>
-          </w:tcPr>
-          <w:p>
-            <w:pPr>
-              <w:jc w:val="left"/>
-            </w:pPr>
+              <w:top w:val="single" w:color="CCCCCC" w:sz="4"/>
+              <w:left w:val="single" w:color="CCCCCC" w:sz="4"/>
+              <w:bottom w:val="single" w:color="CCCCCC" w:sz="4"/>
+              <w:right w:val="single" w:color="CCCCCC" w:sz="4"/>
+            </w:tcBorders>
+            <w:shd w:fill="F5F5F5" w:val="clear"/>
+            <w:tcMar>
+              <w:top w:type="dxa" w:w="120"/>
+              <w:left w:type="dxa" w:w="160"/>
+              <w:bottom w:type="dxa" w:w="120"/>
+              <w:right w:type="dxa" w:w="160"/>
+            </w:tcMar>
+          </w:tcPr>
+          <w:p>
             <w:r>
               <w:rPr>
                 <w:rFonts w:ascii="Arial" w:cs="Arial" w:eastAsia="Arial" w:hAnsi="Arial"/>
@@ -1127,35 +1336,32 @@
                 <w:bCs/>
                 <w:i w:val="false"/>
                 <w:iCs w:val="false"/>
-                <w:color w:val="000000"/>
-                <w:sz w:val="22"/>
-                <w:szCs w:val="22"/>
-              </w:rPr>
-              <w:t xml:space="preserve">Линк към страницата</w:t>
-            </w:r>
-          </w:p>
-        </w:tc>
-        <w:tc>
-          <w:tcPr>
-            <w:tcW w:type="dxa" w:w="7088"/>
-            <w:tcBorders>
-              <w:top w:val="single" w:color="AAAAAA" w:sz="4"/>
-              <w:left w:val="single" w:color="AAAAAA" w:sz="4"/>
-              <w:bottom w:val="single" w:color="AAAAAA" w:sz="4"/>
-              <w:right w:val="single" w:color="AAAAAA" w:sz="4"/>
+                <w:color w:val="333333"/>
+                <w:sz w:val="22"/>
+                <w:szCs w:val="22"/>
+              </w:rPr>
+              <w:t xml:space="preserve">Хостинг</w:t>
+            </w:r>
+          </w:p>
+        </w:tc>
+        <w:tc>
+          <w:tcPr>
+            <w:tcW w:type="dxa" w:w="7092"/>
+            <w:tcBorders>
+              <w:top w:val="single" w:color="CCCCCC" w:sz="4"/>
+              <w:left w:val="single" w:color="CCCCCC" w:sz="4"/>
+              <w:bottom w:val="single" w:color="CCCCCC" w:sz="4"/>
+              <w:right w:val="single" w:color="CCCCCC" w:sz="4"/>
             </w:tcBorders>
             <w:shd w:fill="FFFFFF" w:val="clear"/>
             <w:tcMar>
-              <w:top w:type="dxa" w:w="100"/>
-              <w:left w:type="dxa" w:w="160"/>
-              <w:bottom w:type="dxa" w:w="100"/>
-              <w:right w:type="dxa" w:w="160"/>
-            </w:tcMar>
-          </w:tcPr>
-          <w:p>
-            <w:pPr>
-              <w:jc w:val="left"/>
-            </w:pPr>
+              <w:top w:type="dxa" w:w="120"/>
+              <w:left w:type="dxa" w:w="160"/>
+              <w:bottom w:type="dxa" w:w="120"/>
+              <w:right w:type="dxa" w:w="160"/>
+            </w:tcMar>
+          </w:tcPr>
+          <w:p>
             <w:r>
               <w:rPr>
                 <w:rFonts w:ascii="Arial" w:cs="Arial" w:eastAsia="Arial" w:hAnsi="Arial"/>
@@ -1163,11 +1369,11 @@
                 <w:bCs w:val="false"/>
                 <w:i w:val="false"/>
                 <w:iCs w:val="false"/>
-                <w:color w:val="000000"/>
-                <w:sz w:val="22"/>
-                <w:szCs w:val="22"/>
-              </w:rPr>
-              <w:t xml:space="preserve">https://badmind.github.io/workshop_claude_agents_coursework/</w:t>
+                <w:color w:val="1C1C1C"/>
+                <w:sz w:val="22"/>
+                <w:szCs w:val="22"/>
+              </w:rPr>
+              <w:t xml:space="preserve">GitHub Pages (безплатно)</w:t>
             </w:r>
           </w:p>
         </w:tc>
@@ -1177,23 +1383,20 @@
           <w:tcPr>
             <w:tcW w:type="dxa" w:w="2268"/>
             <w:tcBorders>
-              <w:top w:val="single" w:color="AAAAAA" w:sz="4"/>
-              <w:left w:val="single" w:color="AAAAAA" w:sz="4"/>
-              <w:bottom w:val="single" w:color="AAAAAA" w:sz="4"/>
-              <w:right w:val="single" w:color="AAAAAA" w:sz="4"/>
-            </w:tcBorders>
-            <w:shd w:fill="F2F2F2" w:val="clear"/>
-            <w:tcMar>
-              <w:top w:type="dxa" w:w="100"/>
-              <w:left w:type="dxa" w:w="160"/>
-              <w:bottom w:type="dxa" w:w="100"/>
-              <w:right w:type="dxa" w:w="160"/>
-            </w:tcMar>
-          </w:tcPr>
-          <w:p>
-            <w:pPr>
-              <w:jc w:val="left"/>
-            </w:pPr>
+              <w:top w:val="single" w:color="CCCCCC" w:sz="4"/>
+              <w:left w:val="single" w:color="CCCCCC" w:sz="4"/>
+              <w:bottom w:val="single" w:color="CCCCCC" w:sz="4"/>
+              <w:right w:val="single" w:color="CCCCCC" w:sz="4"/>
+            </w:tcBorders>
+            <w:shd w:fill="F5F5F5" w:val="clear"/>
+            <w:tcMar>
+              <w:top w:type="dxa" w:w="120"/>
+              <w:left w:type="dxa" w:w="160"/>
+              <w:bottom w:type="dxa" w:w="120"/>
+              <w:right w:type="dxa" w:w="160"/>
+            </w:tcMar>
+          </w:tcPr>
+          <w:p>
             <w:r>
               <w:rPr>
                 <w:rFonts w:ascii="Arial" w:cs="Arial" w:eastAsia="Arial" w:hAnsi="Arial"/>
@@ -1201,35 +1404,32 @@
                 <w:bCs/>
                 <w:i w:val="false"/>
                 <w:iCs w:val="false"/>
-                <w:color w:val="000000"/>
-                <w:sz w:val="22"/>
-                <w:szCs w:val="22"/>
-              </w:rPr>
-              <w:t xml:space="preserve">Линк към GitHub</w:t>
-            </w:r>
-          </w:p>
-        </w:tc>
-        <w:tc>
-          <w:tcPr>
-            <w:tcW w:type="dxa" w:w="7088"/>
-            <w:tcBorders>
-              <w:top w:val="single" w:color="AAAAAA" w:sz="4"/>
-              <w:left w:val="single" w:color="AAAAAA" w:sz="4"/>
-              <w:bottom w:val="single" w:color="AAAAAA" w:sz="4"/>
-              <w:right w:val="single" w:color="AAAAAA" w:sz="4"/>
+                <w:color w:val="333333"/>
+                <w:sz w:val="22"/>
+                <w:szCs w:val="22"/>
+              </w:rPr>
+              <w:t xml:space="preserve">Дизайн система</w:t>
+            </w:r>
+          </w:p>
+        </w:tc>
+        <w:tc>
+          <w:tcPr>
+            <w:tcW w:type="dxa" w:w="7092"/>
+            <w:tcBorders>
+              <w:top w:val="single" w:color="CCCCCC" w:sz="4"/>
+              <w:left w:val="single" w:color="CCCCCC" w:sz="4"/>
+              <w:bottom w:val="single" w:color="CCCCCC" w:sz="4"/>
+              <w:right w:val="single" w:color="CCCCCC" w:sz="4"/>
             </w:tcBorders>
             <w:shd w:fill="FFFFFF" w:val="clear"/>
             <w:tcMar>
-              <w:top w:type="dxa" w:w="100"/>
-              <w:left w:type="dxa" w:w="160"/>
-              <w:bottom w:type="dxa" w:w="100"/>
-              <w:right w:type="dxa" w:w="160"/>
-            </w:tcMar>
-          </w:tcPr>
-          <w:p>
-            <w:pPr>
-              <w:jc w:val="left"/>
-            </w:pPr>
+              <w:top w:type="dxa" w:w="120"/>
+              <w:left w:type="dxa" w:w="160"/>
+              <w:bottom w:type="dxa" w:w="120"/>
+              <w:right w:type="dxa" w:w="160"/>
+            </w:tcMar>
+          </w:tcPr>
+          <w:p>
             <w:r>
               <w:rPr>
                 <w:rFonts w:ascii="Arial" w:cs="Arial" w:eastAsia="Arial" w:hAnsi="Arial"/>
@@ -1237,7 +1437,75 @@
                 <w:bCs w:val="false"/>
                 <w:i w:val="false"/>
                 <w:iCs w:val="false"/>
-                <w:color w:val="000000"/>
+                <w:color w:val="1C1C1C"/>
+                <w:sz w:val="22"/>
+                <w:szCs w:val="22"/>
+              </w:rPr>
+              <w:t xml:space="preserve">UI/UX Pro Max Skill — Vibrant &amp; Block-based</w:t>
+            </w:r>
+          </w:p>
+        </w:tc>
+      </w:tr>
+      <w:tr>
+        <w:tc>
+          <w:tcPr>
+            <w:tcW w:type="dxa" w:w="2268"/>
+            <w:tcBorders>
+              <w:top w:val="single" w:color="CCCCCC" w:sz="4"/>
+              <w:left w:val="single" w:color="CCCCCC" w:sz="4"/>
+              <w:bottom w:val="single" w:color="CCCCCC" w:sz="4"/>
+              <w:right w:val="single" w:color="CCCCCC" w:sz="4"/>
+            </w:tcBorders>
+            <w:shd w:fill="F5F5F5" w:val="clear"/>
+            <w:tcMar>
+              <w:top w:type="dxa" w:w="120"/>
+              <w:left w:type="dxa" w:w="160"/>
+              <w:bottom w:type="dxa" w:w="120"/>
+              <w:right w:type="dxa" w:w="160"/>
+            </w:tcMar>
+          </w:tcPr>
+          <w:p>
+            <w:r>
+              <w:rPr>
+                <w:rFonts w:ascii="Arial" w:cs="Arial" w:eastAsia="Arial" w:hAnsi="Arial"/>
+                <w:b/>
+                <w:bCs/>
+                <w:i w:val="false"/>
+                <w:iCs w:val="false"/>
+                <w:color w:val="333333"/>
+                <w:sz w:val="22"/>
+                <w:szCs w:val="22"/>
+              </w:rPr>
+              <w:t xml:space="preserve">GitHub репо</w:t>
+            </w:r>
+          </w:p>
+        </w:tc>
+        <w:tc>
+          <w:tcPr>
+            <w:tcW w:type="dxa" w:w="7092"/>
+            <w:tcBorders>
+              <w:top w:val="single" w:color="CCCCCC" w:sz="4"/>
+              <w:left w:val="single" w:color="CCCCCC" w:sz="4"/>
+              <w:bottom w:val="single" w:color="CCCCCC" w:sz="4"/>
+              <w:right w:val="single" w:color="CCCCCC" w:sz="4"/>
+            </w:tcBorders>
+            <w:shd w:fill="FFFFFF" w:val="clear"/>
+            <w:tcMar>
+              <w:top w:type="dxa" w:w="120"/>
+              <w:left w:type="dxa" w:w="160"/>
+              <w:bottom w:type="dxa" w:w="120"/>
+              <w:right w:type="dxa" w:w="160"/>
+            </w:tcMar>
+          </w:tcPr>
+          <w:p>
+            <w:r>
+              <w:rPr>
+                <w:rFonts w:ascii="Arial" w:cs="Arial" w:eastAsia="Arial" w:hAnsi="Arial"/>
+                <w:b w:val="false"/>
+                <w:bCs w:val="false"/>
+                <w:i w:val="false"/>
+                <w:iCs w:val="false"/>
+                <w:color w:val="1C1C1C"/>
                 <w:sz w:val="22"/>
                 <w:szCs w:val="22"/>
               </w:rPr>
@@ -1249,7 +1517,10 @@
     </w:tbl>
     <w:p>
       <w:pPr>
-        <w:spacing w:after="80" w:before="80"/>
+        <w:pBdr>
+          <w:bottom w:val="single" w:color="EEEEEE" w:sz="4"/>
+        </w:pBdr>
+        <w:spacing w:after="200" w:before="200"/>
       </w:pPr>
       <w:r>
         <w:t xml:space="preserve"/>
@@ -1257,39 +1528,220 @@
     </w:p>
     <w:p>
       <w:pPr>
-        <w:spacing w:after="120" w:before="360"/>
+        <w:spacing w:after="120" w:before="320"/>
       </w:pPr>
       <w:r>
         <w:rPr>
           <w:rFonts w:ascii="Arial" w:cs="Arial" w:eastAsia="Arial" w:hAnsi="Arial"/>
           <w:b/>
           <w:bCs/>
-          <w:sz w:val="36"/>
-          <w:szCs w:val="36"/>
+          <w:color w:val="1C1C1C"/>
+          <w:sz w:val="28"/>
+          <w:szCs w:val="28"/>
           <w:u w:val="single"/>
         </w:rPr>
+        <w:t xml:space="preserve">4. Критерии за оценяване</w:t>
+      </w:r>
+    </w:p>
+    <w:p>
+      <w:pPr>
+        <w:spacing w:after="40" w:before="40"/>
+        <w:ind w:left="360"/>
+      </w:pPr>
+      <w:r>
+        <w:rPr>
+          <w:rFonts w:ascii="Arial" w:cs="Arial" w:eastAsia="Arial" w:hAnsi="Arial"/>
+          <w:color w:val="F97316"/>
+          <w:sz w:val="22"/>
+          <w:szCs w:val="22"/>
+        </w:rPr>
+        <w:t xml:space="preserve">• </w:t>
+      </w:r>
+      <w:r>
+        <w:rPr>
+          <w:rFonts w:ascii="Arial" w:cs="Arial" w:eastAsia="Arial" w:hAnsi="Arial"/>
+          <w:color w:val="333333"/>
+          <w:sz w:val="22"/>
+          <w:szCs w:val="22"/>
+        </w:rPr>
+        <w:t xml:space="preserve">Ясно формулиран реален проблем и целева аудитория</w:t>
+      </w:r>
+    </w:p>
+    <w:p>
+      <w:pPr>
+        <w:spacing w:after="40" w:before="40"/>
+        <w:ind w:left="360"/>
+      </w:pPr>
+      <w:r>
+        <w:rPr>
+          <w:rFonts w:ascii="Arial" w:cs="Arial" w:eastAsia="Arial" w:hAnsi="Arial"/>
+          <w:color w:val="F97316"/>
+          <w:sz w:val="22"/>
+          <w:szCs w:val="22"/>
+        </w:rPr>
+        <w:t xml:space="preserve">• </w:t>
+      </w:r>
+      <w:r>
+        <w:rPr>
+          <w:rFonts w:ascii="Arial" w:cs="Arial" w:eastAsia="Arial" w:hAnsi="Arial"/>
+          <w:color w:val="333333"/>
+          <w:sz w:val="22"/>
+          <w:szCs w:val="22"/>
+        </w:rPr>
+        <w:t xml:space="preserve">Адекватно и приложимо решение, генерирано и доразвито с AI</w:t>
+      </w:r>
+    </w:p>
+    <w:p>
+      <w:pPr>
+        <w:spacing w:after="40" w:before="40"/>
+        <w:ind w:left="360"/>
+      </w:pPr>
+      <w:r>
+        <w:rPr>
+          <w:rFonts w:ascii="Arial" w:cs="Arial" w:eastAsia="Arial" w:hAnsi="Arial"/>
+          <w:color w:val="F97316"/>
+          <w:sz w:val="22"/>
+          <w:szCs w:val="22"/>
+        </w:rPr>
+        <w:t xml:space="preserve">• </w:t>
+      </w:r>
+      <w:r>
+        <w:rPr>
+          <w:rFonts w:ascii="Arial" w:cs="Arial" w:eastAsia="Arial" w:hAnsi="Arial"/>
+          <w:color w:val="333333"/>
+          <w:sz w:val="22"/>
+          <w:szCs w:val="22"/>
+        </w:rPr>
+        <w:t xml:space="preserve">Качество на промптовете и видим процес на итерация</w:t>
+      </w:r>
+    </w:p>
+    <w:p>
+      <w:pPr>
+        <w:spacing w:after="40" w:before="40"/>
+        <w:ind w:left="360"/>
+      </w:pPr>
+      <w:r>
+        <w:rPr>
+          <w:rFonts w:ascii="Arial" w:cs="Arial" w:eastAsia="Arial" w:hAnsi="Arial"/>
+          <w:color w:val="F97316"/>
+          <w:sz w:val="22"/>
+          <w:szCs w:val="22"/>
+        </w:rPr>
+        <w:t xml:space="preserve">• </w:t>
+      </w:r>
+      <w:r>
+        <w:rPr>
+          <w:rFonts w:ascii="Arial" w:cs="Arial" w:eastAsia="Arial" w:hAnsi="Arial"/>
+          <w:color w:val="333333"/>
+          <w:sz w:val="22"/>
+          <w:szCs w:val="22"/>
+        </w:rPr>
+        <w:t xml:space="preserve">Завършена HTML страница с нужните секции</w:t>
+      </w:r>
+    </w:p>
+    <w:p>
+      <w:pPr>
+        <w:spacing w:after="40" w:before="40"/>
+        <w:ind w:left="360"/>
+      </w:pPr>
+      <w:r>
+        <w:rPr>
+          <w:rFonts w:ascii="Arial" w:cs="Arial" w:eastAsia="Arial" w:hAnsi="Arial"/>
+          <w:color w:val="F97316"/>
+          <w:sz w:val="22"/>
+          <w:szCs w:val="22"/>
+        </w:rPr>
+        <w:t xml:space="preserve">• </w:t>
+      </w:r>
+      <w:r>
+        <w:rPr>
+          <w:rFonts w:ascii="Arial" w:cs="Arial" w:eastAsia="Arial" w:hAnsi="Arial"/>
+          <w:color w:val="333333"/>
+          <w:sz w:val="22"/>
+          <w:szCs w:val="22"/>
+        </w:rPr>
+        <w:t xml:space="preserve">Яснота, подреденост и споделен достъп до финалния резултат</w:t>
+      </w:r>
+    </w:p>
+    <w:p>
+      <w:pPr>
+        <w:spacing w:after="80" w:before="80"/>
+      </w:pPr>
+      <w:r>
+        <w:t xml:space="preserve"/>
+      </w:r>
+    </w:p>
+    <w:p>
+      <w:pPr>
+        <w:spacing w:after="120" w:before="60"/>
+      </w:pPr>
+      <w:r>
+        <w:rPr>
+          <w:rFonts w:ascii="Arial" w:cs="Arial" w:eastAsia="Arial" w:hAnsi="Arial"/>
+          <w:i/>
+          <w:iCs/>
+          <w:color w:val="333333"/>
+          <w:sz w:val="22"/>
+          <w:szCs w:val="22"/>
+        </w:rPr>
+        <w:t xml:space="preserve">Няма изискване страницата да бъде сложна или технически перфектна. Важни са ясната идея, правилното използване на AI асистента и завършеното представяне на решението.</w:t>
+      </w:r>
+    </w:p>
+    <w:p>
+      <w:pPr>
+        <w:pBdr>
+          <w:bottom w:val="single" w:color="EEEEEE" w:sz="4"/>
+        </w:pBdr>
+        <w:spacing w:after="200" w:before="200"/>
+      </w:pPr>
+      <w:r>
+        <w:t xml:space="preserve"/>
+      </w:r>
+    </w:p>
+    <w:p>
+      <w:pPr>
+        <w:spacing w:after="120" w:before="320"/>
+      </w:pPr>
+      <w:r>
+        <w:rPr>
+          <w:rFonts w:ascii="Arial" w:cs="Arial" w:eastAsia="Arial" w:hAnsi="Arial"/>
+          <w:b/>
+          <w:bCs/>
+          <w:color w:val="1C1C1C"/>
+          <w:sz w:val="28"/>
+          <w:szCs w:val="28"/>
+          <w:u w:val="single"/>
+        </w:rPr>
         <w:t xml:space="preserve">Предаване</w:t>
       </w:r>
     </w:p>
     <w:p>
       <w:pPr>
-        <w:spacing w:after="160" w:before="60"/>
+        <w:spacing w:after="120" w:before="60"/>
       </w:pPr>
       <w:r>
         <w:rPr>
           <w:rFonts w:ascii="Arial" w:cs="Arial" w:eastAsia="Arial" w:hAnsi="Arial"/>
           <w:i w:val="false"/>
           <w:iCs w:val="false"/>
-          <w:color w:val="000000"/>
-          <w:sz w:val="22"/>
-          <w:szCs w:val="22"/>
-        </w:rPr>
-        <w:t xml:space="preserve">Проектът се качва като PDF или DOCX в Drive и се споделя линк в сайта, секция „Редовен / Поправителен изпит".</w:t>
-      </w:r>
-    </w:p>
-    <w:p>
-      <w:pPr>
-        <w:spacing w:after="60" w:before="120"/>
+          <w:color w:val="333333"/>
+          <w:sz w:val="22"/>
+          <w:szCs w:val="22"/>
+        </w:rPr>
+        <w:t xml:space="preserve">Проектът се качва като PDF или DOCX в Google Drive и се споделя линк в сайта, секция Редовен / Поправителен изпит.</w:t>
+      </w:r>
+    </w:p>
+    <w:p>
+      <w:pPr>
+        <w:spacing w:after="40" w:before="60"/>
+      </w:pPr>
+      <w:r>
+        <w:t xml:space="preserve"/>
+      </w:r>
+    </w:p>
+    <w:p>
+      <w:pPr>
+        <w:spacing w:after="40" w:before="60"/>
       </w:pPr>
       <w:r>
         <w:rPr>
@@ -1312,7 +1764,7 @@
     </w:p>
     <w:p>
       <w:pPr>
-        <w:spacing w:after="60" w:before="60"/>
+        <w:spacing w:after="80" w:before="40"/>
       </w:pPr>
       <w:r>
         <w:rPr>
@@ -1335,10 +1787,25 @@
     </w:p>
     <w:p>
       <w:pPr>
-        <w:spacing w:after="80" w:before="80"/>
+        <w:spacing w:after="80" w:before="160"/>
       </w:pPr>
       <w:r>
         <w:t xml:space="preserve"/>
+      </w:r>
+    </w:p>
+    <w:p>
+      <w:pPr>
+        <w:spacing w:after="0" w:before="80"/>
+        <w:jc w:val="center"/>
+      </w:pPr>
+      <w:r>
+        <w:rPr>
+          <w:rFonts w:ascii="Arial" w:cs="Arial" w:eastAsia="Arial" w:hAnsi="Arial"/>
+          <w:color w:val="AAAAAA"/>
+          <w:sz w:val="18"/>
+          <w:szCs w:val="18"/>
+        </w:rPr>
+        <w:t xml:space="preserve">© SoftUni – https://softuni.bg</w:t>
       </w:r>
     </w:p>
     <w:sectPr>

</xml_diff>

<commit_message>
Update DOCX: add all iterations, EUR prices, UI/UX Skill redesign, mobile optimization, EmailJS rating system
</commit_message>
<xml_diff>
--- a/Exam-Claude-Webpage.docx
+++ b/Exam-Claude-Webpage.docx
@@ -149,6 +149,8 @@
             <w:r>
               <w:rPr>
                 <w:rFonts w:ascii="Calibri" w:cs="Calibri" w:eastAsia="Calibri" w:hAnsi="Calibri"/>
+                <w:b w:val="false"/>
+                <w:bCs w:val="false"/>
                 <w:sz w:val="22"/>
                 <w:szCs w:val="22"/>
               </w:rPr>
@@ -215,6 +217,8 @@
             <w:r>
               <w:rPr>
                 <w:rFonts w:ascii="Calibri" w:cs="Calibri" w:eastAsia="Calibri" w:hAnsi="Calibri"/>
+                <w:b w:val="false"/>
+                <w:bCs w:val="false"/>
                 <w:sz w:val="22"/>
                 <w:szCs w:val="22"/>
               </w:rPr>
@@ -281,6 +285,8 @@
             <w:r>
               <w:rPr>
                 <w:rFonts w:ascii="Calibri" w:cs="Calibri" w:eastAsia="Calibri" w:hAnsi="Calibri"/>
+                <w:b w:val="false"/>
+                <w:bCs w:val="false"/>
                 <w:sz w:val="22"/>
                 <w:szCs w:val="22"/>
               </w:rPr>
@@ -357,7 +363,7 @@
           <w:sz w:val="28"/>
           <w:szCs w:val="28"/>
         </w:rPr>
-        <w:t xml:space="preserve">Избор на сфера и формулиране на проблем</w:t>
+        <w:t xml:space="preserve">1. Избор на сфера и формулиране на проблем</w:t>
       </w:r>
     </w:p>
     <w:p>
@@ -486,6 +492,8 @@
             <w:r>
               <w:rPr>
                 <w:rFonts w:ascii="Calibri" w:cs="Calibri" w:eastAsia="Calibri" w:hAnsi="Calibri"/>
+                <w:b w:val="false"/>
+                <w:bCs w:val="false"/>
                 <w:sz w:val="22"/>
                 <w:szCs w:val="22"/>
               </w:rPr>
@@ -552,6 +560,8 @@
             <w:r>
               <w:rPr>
                 <w:rFonts w:ascii="Calibri" w:cs="Calibri" w:eastAsia="Calibri" w:hAnsi="Calibri"/>
+                <w:b w:val="false"/>
+                <w:bCs w:val="false"/>
                 <w:sz w:val="22"/>
                 <w:szCs w:val="22"/>
               </w:rPr>
@@ -575,7 +585,7 @@
           <w:sz w:val="28"/>
           <w:szCs w:val="28"/>
         </w:rPr>
-        <w:t xml:space="preserve">Генериране на решение с AI асистент</w:t>
+        <w:t xml:space="preserve">2. Генериране на решение с AI асистент</w:t>
       </w:r>
     </w:p>
     <w:p>
@@ -588,7 +598,7 @@
           <w:sz w:val="22"/>
           <w:szCs w:val="22"/>
         </w:rPr>
-        <w:t xml:space="preserve">Опишете проблема на AI асистента и поискайте предложение за просто, приложимо решение. В промпта включете кой има проблема, какво му пречи и какъв тип резултат очаквате.</w:t>
+        <w:t xml:space="preserve">Описах проблема на Claude и поисках предложение за просто, приложимо решение.</w:t>
       </w:r>
     </w:p>
     <w:p>
@@ -604,7 +614,7 @@
           <w:sz w:val="22"/>
           <w:szCs w:val="22"/>
         </w:rPr>
-        <w:t xml:space="preserve">Примерен промпт: „Работя по проблем в сферата на [сфера]. Проблемът е: [описание]. Предложи ми просто решение, обясни на кого помага и дай идеята в 5-6 изречения."</w:t>
+        <w:t xml:space="preserve">Промпт формат: „Работя по проблем в сферата на [сфера]. Проблемът е: [описание]. Предложи ми просто решение, обясни на кого помага и дай идеята в 5-6 изречения."</w:t>
       </w:r>
     </w:p>
     <w:p>
@@ -707,6 +717,8 @@
             <w:r>
               <w:rPr>
                 <w:rFonts w:ascii="Calibri" w:cs="Calibri" w:eastAsia="Calibri" w:hAnsi="Calibri"/>
+                <w:b w:val="false"/>
+                <w:bCs w:val="false"/>
                 <w:sz w:val="22"/>
                 <w:szCs w:val="22"/>
               </w:rPr>
@@ -773,10 +785,12 @@
             <w:r>
               <w:rPr>
                 <w:rFonts w:ascii="Calibri" w:cs="Calibri" w:eastAsia="Calibri" w:hAnsi="Calibri"/>
-                <w:sz w:val="22"/>
-                <w:szCs w:val="22"/>
-              </w:rPr>
-              <w:t xml:space="preserve">Решението е едностранична уебстраница (landing page) за FitZone с ясна структура: Hero секция с ключово послание, блок с 4 услуги, ценоразпис в EUR (4 плана), седмична програма на груповите тренировки, форма за безплатна пробна тренировка и Google Maps с реалната локация. Страницата помага на хора от квартала, търсещи фитнес клуб в Google — виждат всичко необходимо и се записват без обаждане. Дизайнът следва UI/UX Pro Max Skill (Vibrant &amp; Block-based: #F97316 / #22C55E) с пълна мобилна оптимизация и hamburger меню. Хоствана безплатно в GitHub Pages — без месечен разход.</w:t>
+                <w:b w:val="false"/>
+                <w:bCs w:val="false"/>
+                <w:sz w:val="22"/>
+                <w:szCs w:val="22"/>
+              </w:rPr>
+              <w:t xml:space="preserve">Решението е едностранична уебстраница (landing page) за FitZone. Страницата съдържа: Hero секция с послание "Тренирай без компромис" и 4 статистики, блок с 4 услуги, ценоразпис в EUR (4 плана: 5 EUR/посещение до 306 EUR/год.), седмична програма на груповите тренировки, форма за безплатна пробна тренировка, Google Maps embed с реалната локация и контакти. Страницата помага на хора от квартала, търсещи фитнес клуб в Google — виждат всичко необходимо и се записват без да се налага да се обаждат. Хоствана безплатно в GitHub Pages — без месечен разход.</w:t>
             </w:r>
           </w:p>
         </w:tc>
@@ -839,6 +853,8 @@
             <w:r>
               <w:rPr>
                 <w:rFonts w:ascii="Calibri" w:cs="Calibri" w:eastAsia="Calibri" w:hAnsi="Calibri"/>
+                <w:b w:val="false"/>
+                <w:bCs w:val="false"/>
                 <w:sz w:val="22"/>
                 <w:szCs w:val="22"/>
               </w:rPr>
@@ -862,7 +878,7 @@
           <w:sz w:val="28"/>
           <w:szCs w:val="28"/>
         </w:rPr>
-        <w:t xml:space="preserve">Създаване на уебстраница с AI</w:t>
+        <w:t xml:space="preserve">3. Създаване на уебстраница с AI</w:t>
       </w:r>
     </w:p>
     <w:p>
@@ -875,7 +891,7 @@
           <w:sz w:val="22"/>
           <w:szCs w:val="22"/>
         </w:rPr>
-        <w:t xml:space="preserve">Помолете AI асистента да създаде една HTML страница, която представя решението. Страницата трябва да бъде разбираема за потенциален потребител или клиент, дори ако той не е запознат с контекста.</w:t>
+        <w:t xml:space="preserve">Използвах Claude за итеративно генериране и подобряване на HTML страница. Процесът включваше множество промпта и подобрения.</w:t>
       </w:r>
     </w:p>
     <w:p>
@@ -1006,6 +1022,264 @@
           <w:szCs w:val="22"/>
         </w:rPr>
         <w:t xml:space="preserve">четим дизайн с подходящи цветове и подредба.</w:t>
+      </w:r>
+    </w:p>
+    <w:p>
+      <w:pPr>
+        <w:spacing w:after="80" w:before="80"/>
+      </w:pPr>
+      <w:r>
+        <w:rPr>
+          <w:rFonts w:ascii="Calibri" w:cs="Calibri" w:eastAsia="Calibri" w:hAnsi="Calibri"/>
+          <w:sz w:val="22"/>
+          <w:szCs w:val="22"/>
+        </w:rPr>
+        <w:t xml:space="preserve"/>
+      </w:r>
+    </w:p>
+    <w:p>
+      <w:pPr>
+        <w:spacing w:after="120" w:before="60"/>
+      </w:pPr>
+      <w:r>
+        <w:rPr>
+          <w:rFonts w:ascii="Calibri" w:cs="Calibri" w:eastAsia="Calibri" w:hAnsi="Calibri"/>
+          <w:b/>
+          <w:bCs/>
+          <w:sz w:val="22"/>
+          <w:szCs w:val="22"/>
+        </w:rPr>
+        <w:t xml:space="preserve">Изпълнени изисквания и допълнителни функционалности:</w:t>
+      </w:r>
+    </w:p>
+    <w:p>
+      <w:pPr>
+        <w:spacing w:after="40" w:before="40"/>
+        <w:ind w:left="360"/>
+      </w:pPr>
+      <w:r>
+        <w:rPr>
+          <w:rFonts w:ascii="Calibri" w:cs="Calibri" w:eastAsia="Calibri" w:hAnsi="Calibri"/>
+          <w:color w:val="1F4E79"/>
+          <w:sz w:val="22"/>
+          <w:szCs w:val="22"/>
+        </w:rPr>
+        <w:t xml:space="preserve">• </w:t>
+      </w:r>
+      <w:r>
+        <w:rPr>
+          <w:rFonts w:ascii="Calibri" w:cs="Calibri" w:eastAsia="Calibri" w:hAnsi="Calibri"/>
+          <w:sz w:val="22"/>
+          <w:szCs w:val="22"/>
+        </w:rPr>
+        <w:t xml:space="preserve">Hero секция: "Тренирай без компромис" + 4 статистики (7г, 340+ члена, 06:00, 4 треньора)</w:t>
+      </w:r>
+    </w:p>
+    <w:p>
+      <w:pPr>
+        <w:spacing w:after="40" w:before="40"/>
+        <w:ind w:left="360"/>
+      </w:pPr>
+      <w:r>
+        <w:rPr>
+          <w:rFonts w:ascii="Calibri" w:cs="Calibri" w:eastAsia="Calibri" w:hAnsi="Calibri"/>
+          <w:color w:val="1F4E79"/>
+          <w:sz w:val="22"/>
+          <w:szCs w:val="22"/>
+        </w:rPr>
+        <w:t xml:space="preserve">• </w:t>
+      </w:r>
+      <w:r>
+        <w:rPr>
+          <w:rFonts w:ascii="Calibri" w:cs="Calibri" w:eastAsia="Calibri" w:hAnsi="Calibri"/>
+          <w:sz w:val="22"/>
+          <w:szCs w:val="22"/>
+        </w:rPr>
+        <w:t xml:space="preserve">4 услуги (тежести, кардио, групови, личен треньор) + 4 ценови плана в EUR</w:t>
+      </w:r>
+    </w:p>
+    <w:p>
+      <w:pPr>
+        <w:spacing w:after="40" w:before="40"/>
+        <w:ind w:left="360"/>
+      </w:pPr>
+      <w:r>
+        <w:rPr>
+          <w:rFonts w:ascii="Calibri" w:cs="Calibri" w:eastAsia="Calibri" w:hAnsi="Calibri"/>
+          <w:color w:val="1F4E79"/>
+          <w:sz w:val="22"/>
+          <w:szCs w:val="22"/>
+        </w:rPr>
+        <w:t xml:space="preserve">• </w:t>
+      </w:r>
+      <w:r>
+        <w:rPr>
+          <w:rFonts w:ascii="Calibri" w:cs="Calibri" w:eastAsia="Calibri" w:hAnsi="Calibri"/>
+          <w:sz w:val="22"/>
+          <w:szCs w:val="22"/>
+        </w:rPr>
+        <w:t xml:space="preserve">Седмична програма на групови тренировки (6 занятия)</w:t>
+      </w:r>
+    </w:p>
+    <w:p>
+      <w:pPr>
+        <w:spacing w:after="40" w:before="40"/>
+        <w:ind w:left="360"/>
+      </w:pPr>
+      <w:r>
+        <w:rPr>
+          <w:rFonts w:ascii="Calibri" w:cs="Calibri" w:eastAsia="Calibri" w:hAnsi="Calibri"/>
+          <w:color w:val="1F4E79"/>
+          <w:sz w:val="22"/>
+          <w:szCs w:val="22"/>
+        </w:rPr>
+        <w:t xml:space="preserve">• </w:t>
+      </w:r>
+      <w:r>
+        <w:rPr>
+          <w:rFonts w:ascii="Calibri" w:cs="Calibri" w:eastAsia="Calibri" w:hAnsi="Calibri"/>
+          <w:sz w:val="22"/>
+          <w:szCs w:val="22"/>
+        </w:rPr>
+        <w:t xml:space="preserve">Форма за безплатна пробна тренировка с validation и success state</w:t>
+      </w:r>
+    </w:p>
+    <w:p>
+      <w:pPr>
+        <w:spacing w:after="40" w:before="40"/>
+        <w:ind w:left="360"/>
+      </w:pPr>
+      <w:r>
+        <w:rPr>
+          <w:rFonts w:ascii="Calibri" w:cs="Calibri" w:eastAsia="Calibri" w:hAnsi="Calibri"/>
+          <w:color w:val="1F4E79"/>
+          <w:sz w:val="22"/>
+          <w:szCs w:val="22"/>
+        </w:rPr>
+        <w:t xml:space="preserve">• </w:t>
+      </w:r>
+      <w:r>
+        <w:rPr>
+          <w:rFonts w:ascii="Calibri" w:cs="Calibri" w:eastAsia="Calibri" w:hAnsi="Calibri"/>
+          <w:sz w:val="22"/>
+          <w:szCs w:val="22"/>
+        </w:rPr>
+        <w:t xml:space="preserve">Google Maps embed с реалната локация (бул. Царица Йоанна 47, Люлин)</w:t>
+      </w:r>
+    </w:p>
+    <w:p>
+      <w:pPr>
+        <w:spacing w:after="40" w:before="40"/>
+        <w:ind w:left="360"/>
+      </w:pPr>
+      <w:r>
+        <w:rPr>
+          <w:rFonts w:ascii="Calibri" w:cs="Calibri" w:eastAsia="Calibri" w:hAnsi="Calibri"/>
+          <w:color w:val="1F4E79"/>
+          <w:sz w:val="22"/>
+          <w:szCs w:val="22"/>
+        </w:rPr>
+        <w:t xml:space="preserve">• </w:t>
+      </w:r>
+      <w:r>
+        <w:rPr>
+          <w:rFonts w:ascii="Calibri" w:cs="Calibri" w:eastAsia="Calibri" w:hAnsi="Calibri"/>
+          <w:sz w:val="22"/>
+          <w:szCs w:val="22"/>
+        </w:rPr>
+        <w:t xml:space="preserve">Редизайн по UI/UX Pro Max Skill (Vibrant &amp; Block-based) с оценка от скила</w:t>
+      </w:r>
+    </w:p>
+    <w:p>
+      <w:pPr>
+        <w:spacing w:after="40" w:before="40"/>
+        <w:ind w:left="360"/>
+      </w:pPr>
+      <w:r>
+        <w:rPr>
+          <w:rFonts w:ascii="Calibri" w:cs="Calibri" w:eastAsia="Calibri" w:hAnsi="Calibri"/>
+          <w:color w:val="1F4E79"/>
+          <w:sz w:val="22"/>
+          <w:szCs w:val="22"/>
+        </w:rPr>
+        <w:t xml:space="preserve">• </w:t>
+      </w:r>
+      <w:r>
+        <w:rPr>
+          <w:rFonts w:ascii="Calibri" w:cs="Calibri" w:eastAsia="Calibri" w:hAnsi="Calibri"/>
+          <w:sz w:val="22"/>
+          <w:szCs w:val="22"/>
+        </w:rPr>
+        <w:t xml:space="preserve">Пълна мобилна оптимизация: hamburger меню, breakpoints 375/480/768/1024px</w:t>
+      </w:r>
+    </w:p>
+    <w:p>
+      <w:pPr>
+        <w:spacing w:after="40" w:before="40"/>
+        <w:ind w:left="360"/>
+      </w:pPr>
+      <w:r>
+        <w:rPr>
+          <w:rFonts w:ascii="Calibri" w:cs="Calibri" w:eastAsia="Calibri" w:hAnsi="Calibri"/>
+          <w:color w:val="1F4E79"/>
+          <w:sz w:val="22"/>
+          <w:szCs w:val="22"/>
+        </w:rPr>
+        <w:t xml:space="preserve">• </w:t>
+      </w:r>
+      <w:r>
+        <w:rPr>
+          <w:rFonts w:ascii="Calibri" w:cs="Calibri" w:eastAsia="Calibri" w:hAnsi="Calibri"/>
+          <w:sz w:val="22"/>
+          <w:szCs w:val="22"/>
+        </w:rPr>
+        <w:t xml:space="preserve">Бутон "Оцени" с modal по SoftUни скала (2.00-6.00), cert badge за &gt;=5.00</w:t>
+      </w:r>
+    </w:p>
+    <w:p>
+      <w:pPr>
+        <w:spacing w:after="40" w:before="40"/>
+        <w:ind w:left="360"/>
+      </w:pPr>
+      <w:r>
+        <w:rPr>
+          <w:rFonts w:ascii="Calibri" w:cs="Calibri" w:eastAsia="Calibri" w:hAnsi="Calibri"/>
+          <w:color w:val="1F4E79"/>
+          <w:sz w:val="22"/>
+          <w:szCs w:val="22"/>
+        </w:rPr>
+        <w:t xml:space="preserve">• </w:t>
+      </w:r>
+      <w:r>
+        <w:rPr>
+          <w:rFonts w:ascii="Calibri" w:cs="Calibri" w:eastAsia="Calibri" w:hAnsi="Calibri"/>
+          <w:sz w:val="22"/>
+          <w:szCs w:val="22"/>
+        </w:rPr>
+        <w:t xml:space="preserve">EmailJS интеграция за реални имейли с HTML темплейт в дизайна на страницата</w:t>
+      </w:r>
+    </w:p>
+    <w:p>
+      <w:pPr>
+        <w:spacing w:after="40" w:before="40"/>
+        <w:ind w:left="360"/>
+      </w:pPr>
+      <w:r>
+        <w:rPr>
+          <w:rFonts w:ascii="Calibri" w:cs="Calibri" w:eastAsia="Calibri" w:hAnsi="Calibri"/>
+          <w:color w:val="1F4E79"/>
+          <w:sz w:val="22"/>
+          <w:szCs w:val="22"/>
+        </w:rPr>
+        <w:t xml:space="preserve">• </w:t>
+      </w:r>
+      <w:r>
+        <w:rPr>
+          <w:rFonts w:ascii="Calibri" w:cs="Calibri" w:eastAsia="Calibri" w:hAnsi="Calibri"/>
+          <w:sz w:val="22"/>
+          <w:szCs w:val="22"/>
+        </w:rPr>
+        <w:t xml:space="preserve">Изпитен документ достъпен директно от страницата (Свали DOCX / Виж в GitHub)</w:t>
       </w:r>
     </w:p>
     <w:p>
@@ -1034,7 +1308,107 @@
           <w:sz w:val="22"/>
           <w:szCs w:val="22"/>
         </w:rPr>
-        <w:t xml:space="preserve">Примерен промпт: „Направи ми проста, красива уебстраница (HTML) за това решение. Секции: заглавие с кратко послание, 3 ключови ползи и бутон с призив за действие."</w:t>
+        <w:t xml:space="preserve">Промпт за HTML: „Направи ми красива, responsive едностранична HTML страница за фитнес клуб FitZone. Тъмен фон #0F172A, оранжев акцент #F97316, зелен CTA #22C55E, шрифт Barlow Condensed + Barlow от Google Fonts. Секции: Hero с "Тренирай без компромис" + статистики, Услуги (4 карти), Цени в EUR (4 плана), Групови тренировки (6 занятия), Форма за пробна тренировка, Google Maps embed, Footer. Мобилна оптимизация с hamburger меню. Следвай UI/UX Pro Max Skill — стил Vibrant &amp; Block-based."</w:t>
+      </w:r>
+    </w:p>
+    <w:p>
+      <w:pPr>
+        <w:spacing w:after="80" w:before="80"/>
+      </w:pPr>
+      <w:r>
+        <w:rPr>
+          <w:rFonts w:ascii="Calibri" w:cs="Calibri" w:eastAsia="Calibri" w:hAnsi="Calibri"/>
+          <w:sz w:val="22"/>
+          <w:szCs w:val="22"/>
+        </w:rPr>
+        <w:t xml:space="preserve"/>
+      </w:r>
+    </w:p>
+    <w:p>
+      <w:pPr>
+        <w:spacing w:after="120" w:before="60"/>
+      </w:pPr>
+      <w:r>
+        <w:rPr>
+          <w:rFonts w:ascii="Calibri" w:cs="Calibri" w:eastAsia="Calibri" w:hAnsi="Calibri"/>
+          <w:i/>
+          <w:iCs/>
+          <w:color w:val="555555"/>
+          <w:sz w:val="22"/>
+          <w:szCs w:val="22"/>
+        </w:rPr>
+        <w:t xml:space="preserve">Промпт за редизайн: „Направи редизайн на страницата спрямо UI/UX Pro Max Skill (https://github.com/nextlevelbuilder/ui-ux-pro-max-skill). Скилът препоръча за фитнес продукт: Vibrant &amp; Block-based стил, цветова схема Energy Orange #F97316 + Success Green #22C55E на тъмен фон, шрифт Barlow Condensed (потвърден best-for: sports, fitness, gyms), 48px+ block gaps, animated diagonal pattern, bold hover color-shift. Приложи всички правила за accessibility (WCAG AA), touch targets 44px, prefers-reduced-motion, aria-labels, видими focus states."</w:t>
+      </w:r>
+    </w:p>
+    <w:p>
+      <w:pPr>
+        <w:spacing w:after="80" w:before="80"/>
+      </w:pPr>
+      <w:r>
+        <w:rPr>
+          <w:rFonts w:ascii="Calibri" w:cs="Calibri" w:eastAsia="Calibri" w:hAnsi="Calibri"/>
+          <w:sz w:val="22"/>
+          <w:szCs w:val="22"/>
+        </w:rPr>
+        <w:t xml:space="preserve"/>
+      </w:r>
+    </w:p>
+    <w:p>
+      <w:pPr>
+        <w:spacing w:after="120" w:before="60"/>
+      </w:pPr>
+      <w:r>
+        <w:rPr>
+          <w:rFonts w:ascii="Calibri" w:cs="Calibri" w:eastAsia="Calibri" w:hAnsi="Calibri"/>
+          <w:i/>
+          <w:iCs/>
+          <w:color w:val="555555"/>
+          <w:sz w:val="22"/>
+          <w:szCs w:val="22"/>
+        </w:rPr>
+        <w:t xml:space="preserve">Промпт за мобилна оптимизация: „Оптимизирай страницата за мобилни устройства: добави hamburger меню с animated drawer, поправи overflow на heading текстове (word-break), направи всички бутони full-width на мобилен, добави breakpoints 375/480/768/1024px, exam banner да се наредва вертикално на мобилен."</w:t>
+      </w:r>
+    </w:p>
+    <w:p>
+      <w:pPr>
+        <w:spacing w:after="80" w:before="80"/>
+      </w:pPr>
+      <w:r>
+        <w:rPr>
+          <w:rFonts w:ascii="Calibri" w:cs="Calibri" w:eastAsia="Calibri" w:hAnsi="Calibri"/>
+          <w:sz w:val="22"/>
+          <w:szCs w:val="22"/>
+        </w:rPr>
+        <w:t xml:space="preserve"/>
+      </w:r>
+    </w:p>
+    <w:p>
+      <w:pPr>
+        <w:spacing w:after="120" w:before="60"/>
+      </w:pPr>
+      <w:r>
+        <w:rPr>
+          <w:rFonts w:ascii="Calibri" w:cs="Calibri" w:eastAsia="Calibri" w:hAnsi="Calibri"/>
+          <w:i/>
+          <w:iCs/>
+          <w:color w:val="555555"/>
+          <w:sz w:val="22"/>
+          <w:szCs w:val="22"/>
+        </w:rPr>
+        <w:t xml:space="preserve">Промпт за оценъчен бутон: „Добави бутон "Оцени" до бутоните за документа. При клик отваря modal с: оценки по SoftUni скала (2.00/3.00/4.00/5.00/5.50/6.00), оценки &gt;= 5.00 маркирани в зелено (дават право на сертификат), поле за коментар, поле за CC имейл, анимация с хвърчащи писма при изпращане, прогрес бар и success съобщение. Свържи с EmailJS (service_0bdu17s / template_i7idtwm) за реални имейли до pachovski@gmail.com. Темплейтът да е с дизайна на страницата: тъмен фон, оранжево/зелено, описание на оценката, критерии за оценяване, cert badge."</w:t>
+      </w:r>
+    </w:p>
+    <w:p>
+      <w:pPr>
+        <w:spacing w:after="80" w:before="80"/>
+      </w:pPr>
+      <w:r>
+        <w:rPr>
+          <w:rFonts w:ascii="Calibri" w:cs="Calibri" w:eastAsia="Calibri" w:hAnsi="Calibri"/>
+          <w:sz w:val="22"/>
+          <w:szCs w:val="22"/>
+        </w:rPr>
+        <w:t xml:space="preserve"/>
       </w:r>
     </w:p>
     <w:p>
@@ -1137,10 +1511,12 @@
             <w:r>
               <w:rPr>
                 <w:rFonts w:ascii="Calibri" w:cs="Calibri" w:eastAsia="Calibri" w:hAnsi="Calibri"/>
-                <w:sz w:val="22"/>
-                <w:szCs w:val="22"/>
-              </w:rPr>
-              <w:t xml:space="preserve">Направи ми красива, responsive HTML страница за фитнес клуб FitZone. Тъмен фон #0F172A, оранжев акцент #F97316, зелен CTA #22C55E, шрифт Barlow Condensed. Секции: Hero с "Тренирай без компромис" + статистики, Услуги (4 карти), Цени в EUR (4 плана), Групови тренировки, Форма за пробна тренировка, Google Maps embed, Footer. Мобилна оптимизация с hamburger меню.</w:t>
+                <w:b w:val="false"/>
+                <w:bCs w:val="false"/>
+                <w:sz w:val="22"/>
+                <w:szCs w:val="22"/>
+              </w:rPr>
+              <w:t xml:space="preserve">Направи ми красива, responsive едностранична HTML страница за фитнес клуб FitZone. Тъмен фон #0F172A, оранжев акцент #F97316, зелен CTA #22C55E, шрифт Barlow Condensed + Barlow от Google Fonts. Секции: Hero с "Тренирай без компромис" + статистики, Услуги (4 карти), Цени в EUR (4 плана), Групови тренировки (6 занятия), Форма за пробна тренировка, Google Maps embed, Footer. Мобилна оптимизация с hamburger меню. Следвай UI/UX Pro Max Skill — стил Vibrant &amp; Block-based.</w:t>
             </w:r>
           </w:p>
         </w:tc>
@@ -1203,6 +1579,8 @@
             <w:r>
               <w:rPr>
                 <w:rFonts w:ascii="Calibri" w:cs="Calibri" w:eastAsia="Calibri" w:hAnsi="Calibri"/>
+                <w:b w:val="false"/>
+                <w:bCs w:val="false"/>
                 <w:sz w:val="22"/>
                 <w:szCs w:val="22"/>
               </w:rPr>
@@ -1299,6 +1677,8 @@
             <w:r>
               <w:rPr>
                 <w:rFonts w:ascii="Calibri" w:cs="Calibri" w:eastAsia="Calibri" w:hAnsi="Calibri"/>
+                <w:b w:val="false"/>
+                <w:bCs w:val="false"/>
                 <w:sz w:val="22"/>
                 <w:szCs w:val="22"/>
               </w:rPr>
@@ -1365,10 +1745,12 @@
             <w:r>
               <w:rPr>
                 <w:rFonts w:ascii="Calibri" w:cs="Calibri" w:eastAsia="Calibri" w:hAnsi="Calibri"/>
-                <w:sz w:val="22"/>
-                <w:szCs w:val="22"/>
-              </w:rPr>
-              <w:t xml:space="preserve">HTML5 / CSS3 / JavaScript — без фреймуъркове</w:t>
+                <w:b w:val="false"/>
+                <w:bCs w:val="false"/>
+                <w:sz w:val="22"/>
+                <w:szCs w:val="22"/>
+              </w:rPr>
+              <w:t xml:space="preserve">HTML5 / CSS3 / JavaScript — без фреймуъркове, single-file</w:t>
             </w:r>
           </w:p>
         </w:tc>
@@ -1431,10 +1813,12 @@
             <w:r>
               <w:rPr>
                 <w:rFonts w:ascii="Calibri" w:cs="Calibri" w:eastAsia="Calibri" w:hAnsi="Calibri"/>
-                <w:sz w:val="22"/>
-                <w:szCs w:val="22"/>
-              </w:rPr>
-              <w:t xml:space="preserve">GitHub Pages (безплатно)</w:t>
+                <w:b w:val="false"/>
+                <w:bCs w:val="false"/>
+                <w:sz w:val="22"/>
+                <w:szCs w:val="22"/>
+              </w:rPr>
+              <w:t xml:space="preserve">GitHub Pages (безплатно, автоматично при push към main)</w:t>
             </w:r>
           </w:p>
         </w:tc>
@@ -1497,10 +1881,216 @@
             <w:r>
               <w:rPr>
                 <w:rFonts w:ascii="Calibri" w:cs="Calibri" w:eastAsia="Calibri" w:hAnsi="Calibri"/>
-                <w:sz w:val="22"/>
-                <w:szCs w:val="22"/>
-              </w:rPr>
-              <w:t xml:space="preserve">UI/UX Pro Max Skill — Vibrant &amp; Block-based</w:t>
+                <w:b w:val="false"/>
+                <w:bCs w:val="false"/>
+                <w:sz w:val="22"/>
+                <w:szCs w:val="22"/>
+              </w:rPr>
+              <w:t xml:space="preserve">UI/UX Pro Max Skill — Vibrant &amp; Block-based (nextlevelbuilder/ui-ux-pro-max-skill)</w:t>
+            </w:r>
+          </w:p>
+        </w:tc>
+      </w:tr>
+      <w:tr>
+        <w:tc>
+          <w:tcPr>
+            <w:tcW w:type="dxa" w:w="2500"/>
+            <w:tcBorders>
+              <w:top w:val="single" w:color="CCCCCC" w:sz="4"/>
+              <w:left w:val="single" w:color="CCCCCC" w:sz="4"/>
+              <w:bottom w:val="single" w:color="CCCCCC" w:sz="4"/>
+              <w:right w:val="single" w:color="CCCCCC" w:sz="4"/>
+            </w:tcBorders>
+            <w:shd w:fill="F2F2F2" w:val="clear"/>
+            <w:tcMar>
+              <w:top w:type="dxa" w:w="100"/>
+              <w:left w:type="dxa" w:w="160"/>
+              <w:bottom w:type="dxa" w:w="100"/>
+              <w:right w:type="dxa" w:w="160"/>
+            </w:tcMar>
+          </w:tcPr>
+          <w:p>
+            <w:pPr>
+              <w:spacing w:after="120" w:before="60"/>
+            </w:pPr>
+            <w:r>
+              <w:rPr>
+                <w:rFonts w:ascii="Calibri" w:cs="Calibri" w:eastAsia="Calibri" w:hAnsi="Calibri"/>
+                <w:b/>
+                <w:bCs/>
+                <w:sz w:val="22"/>
+                <w:szCs w:val="22"/>
+              </w:rPr>
+              <w:t xml:space="preserve">Цени</w:t>
+            </w:r>
+          </w:p>
+        </w:tc>
+        <w:tc>
+          <w:tcPr>
+            <w:tcW w:type="dxa" w:w="6860"/>
+            <w:tcBorders>
+              <w:top w:val="single" w:color="CCCCCC" w:sz="4"/>
+              <w:left w:val="single" w:color="CCCCCC" w:sz="4"/>
+              <w:bottom w:val="single" w:color="CCCCCC" w:sz="4"/>
+              <w:right w:val="single" w:color="CCCCCC" w:sz="4"/>
+            </w:tcBorders>
+            <w:shd w:fill="FFFFFF" w:val="clear"/>
+            <w:tcMar>
+              <w:top w:type="dxa" w:w="100"/>
+              <w:left w:type="dxa" w:w="160"/>
+              <w:bottom w:type="dxa" w:w="100"/>
+              <w:right w:type="dxa" w:w="160"/>
+            </w:tcMar>
+          </w:tcPr>
+          <w:p>
+            <w:pPr>
+              <w:spacing w:after="120" w:before="60"/>
+            </w:pPr>
+            <w:r>
+              <w:rPr>
+                <w:rFonts w:ascii="Calibri" w:cs="Calibri" w:eastAsia="Calibri" w:hAnsi="Calibri"/>
+                <w:b w:val="false"/>
+                <w:bCs w:val="false"/>
+                <w:sz w:val="22"/>
+                <w:szCs w:val="22"/>
+              </w:rPr>
+              <w:t xml:space="preserve">EUR — еднократно €5, месечен €28, месечен Plus €40, годишен €306</w:t>
+            </w:r>
+          </w:p>
+        </w:tc>
+      </w:tr>
+      <w:tr>
+        <w:tc>
+          <w:tcPr>
+            <w:tcW w:type="dxa" w:w="2500"/>
+            <w:tcBorders>
+              <w:top w:val="single" w:color="CCCCCC" w:sz="4"/>
+              <w:left w:val="single" w:color="CCCCCC" w:sz="4"/>
+              <w:bottom w:val="single" w:color="CCCCCC" w:sz="4"/>
+              <w:right w:val="single" w:color="CCCCCC" w:sz="4"/>
+            </w:tcBorders>
+            <w:shd w:fill="F2F2F2" w:val="clear"/>
+            <w:tcMar>
+              <w:top w:type="dxa" w:w="100"/>
+              <w:left w:type="dxa" w:w="160"/>
+              <w:bottom w:type="dxa" w:w="100"/>
+              <w:right w:type="dxa" w:w="160"/>
+            </w:tcMar>
+          </w:tcPr>
+          <w:p>
+            <w:pPr>
+              <w:spacing w:after="120" w:before="60"/>
+            </w:pPr>
+            <w:r>
+              <w:rPr>
+                <w:rFonts w:ascii="Calibri" w:cs="Calibri" w:eastAsia="Calibri" w:hAnsi="Calibri"/>
+                <w:b/>
+                <w:bCs/>
+                <w:sz w:val="22"/>
+                <w:szCs w:val="22"/>
+              </w:rPr>
+              <w:t xml:space="preserve">Имейл интеграция</w:t>
+            </w:r>
+          </w:p>
+        </w:tc>
+        <w:tc>
+          <w:tcPr>
+            <w:tcW w:type="dxa" w:w="6860"/>
+            <w:tcBorders>
+              <w:top w:val="single" w:color="CCCCCC" w:sz="4"/>
+              <w:left w:val="single" w:color="CCCCCC" w:sz="4"/>
+              <w:bottom w:val="single" w:color="CCCCCC" w:sz="4"/>
+              <w:right w:val="single" w:color="CCCCCC" w:sz="4"/>
+            </w:tcBorders>
+            <w:shd w:fill="FFFFFF" w:val="clear"/>
+            <w:tcMar>
+              <w:top w:type="dxa" w:w="100"/>
+              <w:left w:type="dxa" w:w="160"/>
+              <w:bottom w:type="dxa" w:w="100"/>
+              <w:right w:type="dxa" w:w="160"/>
+            </w:tcMar>
+          </w:tcPr>
+          <w:p>
+            <w:pPr>
+              <w:spacing w:after="120" w:before="60"/>
+            </w:pPr>
+            <w:r>
+              <w:rPr>
+                <w:rFonts w:ascii="Calibri" w:cs="Calibri" w:eastAsia="Calibri" w:hAnsi="Calibri"/>
+                <w:b w:val="false"/>
+                <w:bCs w:val="false"/>
+                <w:sz w:val="22"/>
+                <w:szCs w:val="22"/>
+              </w:rPr>
+              <w:t xml:space="preserve">EmailJS (service_0bdu17s) — реални имейли при оценяване</w:t>
+            </w:r>
+          </w:p>
+        </w:tc>
+      </w:tr>
+      <w:tr>
+        <w:tc>
+          <w:tcPr>
+            <w:tcW w:type="dxa" w:w="2500"/>
+            <w:tcBorders>
+              <w:top w:val="single" w:color="CCCCCC" w:sz="4"/>
+              <w:left w:val="single" w:color="CCCCCC" w:sz="4"/>
+              <w:bottom w:val="single" w:color="CCCCCC" w:sz="4"/>
+              <w:right w:val="single" w:color="CCCCCC" w:sz="4"/>
+            </w:tcBorders>
+            <w:shd w:fill="F2F2F2" w:val="clear"/>
+            <w:tcMar>
+              <w:top w:type="dxa" w:w="100"/>
+              <w:left w:type="dxa" w:w="160"/>
+              <w:bottom w:type="dxa" w:w="100"/>
+              <w:right w:type="dxa" w:w="160"/>
+            </w:tcMar>
+          </w:tcPr>
+          <w:p>
+            <w:pPr>
+              <w:spacing w:after="120" w:before="60"/>
+            </w:pPr>
+            <w:r>
+              <w:rPr>
+                <w:rFonts w:ascii="Calibri" w:cs="Calibri" w:eastAsia="Calibri" w:hAnsi="Calibri"/>
+                <w:b/>
+                <w:bCs/>
+                <w:sz w:val="22"/>
+                <w:szCs w:val="22"/>
+              </w:rPr>
+              <w:t xml:space="preserve">Оценъчна система</w:t>
+            </w:r>
+          </w:p>
+        </w:tc>
+        <w:tc>
+          <w:tcPr>
+            <w:tcW w:type="dxa" w:w="6860"/>
+            <w:tcBorders>
+              <w:top w:val="single" w:color="CCCCCC" w:sz="4"/>
+              <w:left w:val="single" w:color="CCCCCC" w:sz="4"/>
+              <w:bottom w:val="single" w:color="CCCCCC" w:sz="4"/>
+              <w:right w:val="single" w:color="CCCCCC" w:sz="4"/>
+            </w:tcBorders>
+            <w:shd w:fill="FFFFFF" w:val="clear"/>
+            <w:tcMar>
+              <w:top w:type="dxa" w:w="100"/>
+              <w:left w:type="dxa" w:w="160"/>
+              <w:bottom w:type="dxa" w:w="100"/>
+              <w:right w:type="dxa" w:w="160"/>
+            </w:tcMar>
+          </w:tcPr>
+          <w:p>
+            <w:pPr>
+              <w:spacing w:after="120" w:before="60"/>
+            </w:pPr>
+            <w:r>
+              <w:rPr>
+                <w:rFonts w:ascii="Calibri" w:cs="Calibri" w:eastAsia="Calibri" w:hAnsi="Calibri"/>
+                <w:b w:val="false"/>
+                <w:bCs w:val="false"/>
+                <w:sz w:val="22"/>
+                <w:szCs w:val="22"/>
+              </w:rPr>
+              <w:t xml:space="preserve">SoftUni скала 2.00-6.00, cert badge за &gt;=5.00, HTML email темплейт</w:t>
             </w:r>
           </w:p>
         </w:tc>
@@ -1520,7 +2110,7 @@
           <w:sz w:val="28"/>
           <w:szCs w:val="28"/>
         </w:rPr>
-        <w:t xml:space="preserve">Критерии за оценяване</w:t>
+        <w:t xml:space="preserve">4. Критерии за оценяване</w:t>
       </w:r>
     </w:p>
     <w:p>

</xml_diff>